<commit_message>
feat: Parcial parte 3 - Analisis de requerimientos, Pantallas Figma
</commit_message>
<xml_diff>
--- a/DOSW-ParcialT1/docs/requirements/PWCT-02 CrearMascota.docx
+++ b/DOSW-ParcialT1/docs/requirements/PWCT-02 CrearMascota.docx
@@ -1124,7 +1124,7 @@
     <w:tbl>
       <w:tblPr>
         <w:tblStyle w:val="a2"/>
-        <w:tblW w:w="10080" w:type="dxa"/>
+        <w:tblW w:w="10190" w:type="dxa"/>
         <w:tblBorders>
           <w:top w:val="single" w:sz="4" w:space="0" w:color="000000"/>
           <w:left w:val="single" w:sz="4" w:space="0" w:color="000000"/>
@@ -1137,11 +1137,11 @@
         <w:tblLook w:val="0000" w:firstRow="0" w:lastRow="0" w:firstColumn="0" w:lastColumn="0" w:noHBand="0" w:noVBand="0"/>
       </w:tblPr>
       <w:tblGrid>
-        <w:gridCol w:w="2000"/>
-        <w:gridCol w:w="3080"/>
-        <w:gridCol w:w="1800"/>
-        <w:gridCol w:w="2200"/>
-        <w:gridCol w:w="1000"/>
+        <w:gridCol w:w="2114"/>
+        <w:gridCol w:w="3255"/>
+        <w:gridCol w:w="1439"/>
+        <w:gridCol w:w="2325"/>
+        <w:gridCol w:w="1057"/>
       </w:tblGrid>
       <w:tr>
         <w:trPr>
@@ -1149,7 +1149,7 @@
         </w:trPr>
         <w:tc>
           <w:tcPr>
-            <w:tcW w:w="2000" w:type="dxa"/>
+            <w:tcW w:w="2114" w:type="dxa"/>
             <w:tcBorders>
               <w:top w:val="single" w:sz="4" w:space="0" w:color="B7C2D6"/>
               <w:left w:val="single" w:sz="4" w:space="0" w:color="B7C2D6"/>
@@ -1185,7 +1185,7 @@
         </w:tc>
         <w:tc>
           <w:tcPr>
-            <w:tcW w:w="3080" w:type="dxa"/>
+            <w:tcW w:w="3255" w:type="dxa"/>
             <w:tcBorders>
               <w:top w:val="single" w:sz="4" w:space="0" w:color="B7C2D6"/>
               <w:left w:val="single" w:sz="4" w:space="0" w:color="B7C2D6"/>
@@ -1221,7 +1221,7 @@
         </w:tc>
         <w:tc>
           <w:tcPr>
-            <w:tcW w:w="1800" w:type="dxa"/>
+            <w:tcW w:w="1439" w:type="dxa"/>
             <w:tcBorders>
               <w:top w:val="single" w:sz="4" w:space="0" w:color="B7C2D6"/>
               <w:left w:val="single" w:sz="4" w:space="0" w:color="B7C2D6"/>
@@ -1255,7 +1255,7 @@
         </w:tc>
         <w:tc>
           <w:tcPr>
-            <w:tcW w:w="2200" w:type="dxa"/>
+            <w:tcW w:w="2325" w:type="dxa"/>
             <w:tcBorders>
               <w:top w:val="single" w:sz="4" w:space="0" w:color="B7C2D6"/>
               <w:left w:val="single" w:sz="4" w:space="0" w:color="B7C2D6"/>
@@ -1313,7 +1313,7 @@
         </w:tc>
         <w:tc>
           <w:tcPr>
-            <w:tcW w:w="1000" w:type="dxa"/>
+            <w:tcW w:w="1057" w:type="dxa"/>
             <w:tcBorders>
               <w:top w:val="single" w:sz="4" w:space="0" w:color="B7C2D6"/>
               <w:left w:val="single" w:sz="4" w:space="0" w:color="B7C2D6"/>
@@ -1351,48 +1351,66 @@
       <w:tr>
         <w:tc>
           <w:tcPr>
-            <w:tcW w:w="2000" w:type="dxa"/>
-            <w:tcBorders>
-              <w:top w:val="single" w:sz="4" w:space="0" w:color="B7C2D6"/>
-              <w:left w:val="single" w:sz="4" w:space="0" w:color="B7C2D6"/>
-              <w:bottom w:val="single" w:sz="4" w:space="0" w:color="B7C2D6"/>
-              <w:right w:val="single" w:sz="4" w:space="0" w:color="B7C2D6"/>
-            </w:tcBorders>
-            <w:tcMar>
-              <w:top w:w="80" w:type="dxa"/>
-              <w:left w:w="130" w:type="dxa"/>
-              <w:bottom w:w="80" w:type="dxa"/>
-              <w:right w:w="130" w:type="dxa"/>
-            </w:tcMar>
-            <w:vAlign w:val="center"/>
-          </w:tcPr>
-          <w:p>
-            <w:r>
-              <w:t>ID</w:t>
-            </w:r>
-          </w:p>
-        </w:tc>
-        <w:tc>
-          <w:tcPr>
-            <w:tcW w:w="3080" w:type="dxa"/>
-            <w:tcBorders>
-              <w:top w:val="single" w:sz="4" w:space="0" w:color="B7C2D6"/>
-              <w:left w:val="single" w:sz="4" w:space="0" w:color="B7C2D6"/>
-              <w:bottom w:val="single" w:sz="4" w:space="0" w:color="B7C2D6"/>
-              <w:right w:val="single" w:sz="4" w:space="0" w:color="B7C2D6"/>
-            </w:tcBorders>
-            <w:tcMar>
-              <w:top w:w="80" w:type="dxa"/>
-              <w:left w:w="130" w:type="dxa"/>
-              <w:bottom w:w="80" w:type="dxa"/>
-              <w:right w:w="130" w:type="dxa"/>
-            </w:tcMar>
-            <w:vAlign w:val="center"/>
-          </w:tcPr>
-          <w:p>
-            <w:proofErr w:type="spellStart"/>
-            <w:r>
-              <w:t>Identificador</w:t>
+            <w:tcW w:w="2114" w:type="dxa"/>
+            <w:tcBorders>
+              <w:top w:val="single" w:sz="4" w:space="0" w:color="B7C2D6"/>
+              <w:left w:val="single" w:sz="4" w:space="0" w:color="B7C2D6"/>
+              <w:bottom w:val="single" w:sz="4" w:space="0" w:color="B7C2D6"/>
+              <w:right w:val="single" w:sz="4" w:space="0" w:color="B7C2D6"/>
+            </w:tcBorders>
+            <w:tcMar>
+              <w:top w:w="80" w:type="dxa"/>
+              <w:left w:w="130" w:type="dxa"/>
+              <w:bottom w:w="80" w:type="dxa"/>
+              <w:right w:w="130" w:type="dxa"/>
+            </w:tcMar>
+            <w:vAlign w:val="center"/>
+          </w:tcPr>
+          <w:p>
+            <w:proofErr w:type="spellStart"/>
+            <w:r>
+              <w:t>Nombre</w:t>
+            </w:r>
+            <w:proofErr w:type="spellEnd"/>
+          </w:p>
+        </w:tc>
+        <w:tc>
+          <w:tcPr>
+            <w:tcW w:w="3255" w:type="dxa"/>
+            <w:tcBorders>
+              <w:top w:val="single" w:sz="4" w:space="0" w:color="B7C2D6"/>
+              <w:left w:val="single" w:sz="4" w:space="0" w:color="B7C2D6"/>
+              <w:bottom w:val="single" w:sz="4" w:space="0" w:color="B7C2D6"/>
+              <w:right w:val="single" w:sz="4" w:space="0" w:color="B7C2D6"/>
+            </w:tcBorders>
+            <w:tcMar>
+              <w:top w:w="80" w:type="dxa"/>
+              <w:left w:w="130" w:type="dxa"/>
+              <w:bottom w:w="80" w:type="dxa"/>
+              <w:right w:w="130" w:type="dxa"/>
+            </w:tcMar>
+            <w:vAlign w:val="center"/>
+          </w:tcPr>
+          <w:p>
+            <w:proofErr w:type="spellStart"/>
+            <w:r>
+              <w:t>Nombre</w:t>
+            </w:r>
+            <w:proofErr w:type="spellEnd"/>
+            <w:r>
+              <w:t xml:space="preserve"> al que </w:t>
+            </w:r>
+            <w:proofErr w:type="spellStart"/>
+            <w:r>
+              <w:t>responde</w:t>
+            </w:r>
+            <w:proofErr w:type="spellEnd"/>
+            <w:r>
+              <w:t xml:space="preserve"> la </w:t>
+            </w:r>
+            <w:proofErr w:type="spellStart"/>
+            <w:r>
+              <w:t>mascota</w:t>
             </w:r>
             <w:proofErr w:type="spellEnd"/>
             <w:r>
@@ -1400,92 +1418,99 @@
             </w:r>
             <w:proofErr w:type="spellStart"/>
             <w:r>
-              <w:t>unico</w:t>
-            </w:r>
-            <w:proofErr w:type="spellEnd"/>
-            <w:r>
-              <w:t xml:space="preserve"> para la </w:t>
-            </w:r>
-            <w:proofErr w:type="spellStart"/>
-            <w:r>
-              <w:t>mascota</w:t>
-            </w:r>
-            <w:proofErr w:type="spellEnd"/>
-          </w:p>
-        </w:tc>
-        <w:tc>
-          <w:tcPr>
-            <w:tcW w:w="1800" w:type="dxa"/>
-            <w:tcBorders>
-              <w:top w:val="single" w:sz="4" w:space="0" w:color="B7C2D6"/>
-              <w:left w:val="single" w:sz="4" w:space="0" w:color="B7C2D6"/>
-              <w:bottom w:val="single" w:sz="4" w:space="0" w:color="B7C2D6"/>
-              <w:right w:val="single" w:sz="4" w:space="0" w:color="B7C2D6"/>
-            </w:tcBorders>
-            <w:tcMar>
-              <w:top w:w="80" w:type="dxa"/>
-              <w:left w:w="130" w:type="dxa"/>
-              <w:bottom w:w="80" w:type="dxa"/>
-              <w:right w:w="130" w:type="dxa"/>
-            </w:tcMar>
-            <w:vAlign w:val="center"/>
-          </w:tcPr>
-          <w:p>
-            <w:r>
-              <w:t>UU</w:t>
-            </w:r>
-            <w:r>
-              <w:t>ID</w:t>
-            </w:r>
-          </w:p>
-        </w:tc>
-        <w:tc>
-          <w:tcPr>
-            <w:tcW w:w="2200" w:type="dxa"/>
-            <w:tcBorders>
-              <w:top w:val="single" w:sz="4" w:space="0" w:color="B7C2D6"/>
-              <w:left w:val="single" w:sz="4" w:space="0" w:color="B7C2D6"/>
-              <w:bottom w:val="single" w:sz="4" w:space="0" w:color="B7C2D6"/>
-              <w:right w:val="single" w:sz="4" w:space="0" w:color="B7C2D6"/>
-            </w:tcBorders>
-            <w:tcMar>
-              <w:top w:w="80" w:type="dxa"/>
-              <w:left w:w="130" w:type="dxa"/>
-              <w:bottom w:w="80" w:type="dxa"/>
-              <w:right w:w="130" w:type="dxa"/>
-            </w:tcMar>
-            <w:vAlign w:val="center"/>
-          </w:tcPr>
-          <w:p>
-            <w:proofErr w:type="spellStart"/>
-            <w:r>
-              <w:t>Formato</w:t>
-            </w:r>
-            <w:proofErr w:type="spellEnd"/>
-            <w:r>
-              <w:t xml:space="preserve"> </w:t>
-            </w:r>
-            <w:proofErr w:type="spellStart"/>
-            <w:r>
-              <w:t>unico</w:t>
-            </w:r>
-            <w:proofErr w:type="spellEnd"/>
-            <w:r>
-              <w:t xml:space="preserve"> auto-</w:t>
-            </w:r>
-            <w:proofErr w:type="spellStart"/>
-            <w:r>
-              <w:t>Generado</w:t>
-            </w:r>
-            <w:proofErr w:type="spellEnd"/>
-            <w:r>
-              <w:t xml:space="preserve"> ESPECIE-XXX</w:t>
-            </w:r>
-          </w:p>
-        </w:tc>
-        <w:tc>
-          <w:tcPr>
-            <w:tcW w:w="1000" w:type="dxa"/>
+              <w:t>cuando</w:t>
+            </w:r>
+            <w:proofErr w:type="spellEnd"/>
+            <w:r>
+              <w:t xml:space="preserve"> es </w:t>
+            </w:r>
+            <w:proofErr w:type="spellStart"/>
+            <w:r>
+              <w:t>llamado</w:t>
+            </w:r>
+            <w:proofErr w:type="spellEnd"/>
+            <w:r>
+              <w:t xml:space="preserve"> por </w:t>
+            </w:r>
+            <w:proofErr w:type="spellStart"/>
+            <w:r>
+              <w:t>este</w:t>
+            </w:r>
+            <w:proofErr w:type="spellEnd"/>
+          </w:p>
+        </w:tc>
+        <w:tc>
+          <w:tcPr>
+            <w:tcW w:w="1439" w:type="dxa"/>
+            <w:tcBorders>
+              <w:top w:val="single" w:sz="4" w:space="0" w:color="B7C2D6"/>
+              <w:left w:val="single" w:sz="4" w:space="0" w:color="B7C2D6"/>
+              <w:bottom w:val="single" w:sz="4" w:space="0" w:color="B7C2D6"/>
+              <w:right w:val="single" w:sz="4" w:space="0" w:color="B7C2D6"/>
+            </w:tcBorders>
+            <w:tcMar>
+              <w:top w:w="80" w:type="dxa"/>
+              <w:left w:w="130" w:type="dxa"/>
+              <w:bottom w:w="80" w:type="dxa"/>
+              <w:right w:w="130" w:type="dxa"/>
+            </w:tcMar>
+            <w:vAlign w:val="center"/>
+          </w:tcPr>
+          <w:p>
+            <w:proofErr w:type="spellStart"/>
+            <w:r>
+              <w:t>Texto</w:t>
+            </w:r>
+            <w:proofErr w:type="spellEnd"/>
+          </w:p>
+        </w:tc>
+        <w:tc>
+          <w:tcPr>
+            <w:tcW w:w="2325" w:type="dxa"/>
+            <w:tcBorders>
+              <w:top w:val="single" w:sz="4" w:space="0" w:color="B7C2D6"/>
+              <w:left w:val="single" w:sz="4" w:space="0" w:color="B7C2D6"/>
+              <w:bottom w:val="single" w:sz="4" w:space="0" w:color="B7C2D6"/>
+              <w:right w:val="single" w:sz="4" w:space="0" w:color="B7C2D6"/>
+            </w:tcBorders>
+            <w:tcMar>
+              <w:top w:w="80" w:type="dxa"/>
+              <w:left w:w="130" w:type="dxa"/>
+              <w:bottom w:w="80" w:type="dxa"/>
+              <w:right w:w="130" w:type="dxa"/>
+            </w:tcMar>
+            <w:vAlign w:val="center"/>
+          </w:tcPr>
+          <w:p>
+            <w:r>
+              <w:t xml:space="preserve">Tiene que </w:t>
+            </w:r>
+            <w:proofErr w:type="spellStart"/>
+            <w:r>
+              <w:t>poseer</w:t>
+            </w:r>
+            <w:proofErr w:type="spellEnd"/>
+            <w:r>
+              <w:t xml:space="preserve"> de un </w:t>
+            </w:r>
+            <w:proofErr w:type="spellStart"/>
+            <w:r>
+              <w:t>minimo</w:t>
+            </w:r>
+            <w:proofErr w:type="spellEnd"/>
+            <w:r>
+              <w:t xml:space="preserve"> de 3 </w:t>
+            </w:r>
+            <w:proofErr w:type="spellStart"/>
+            <w:r>
+              <w:t>caracteres</w:t>
+            </w:r>
+            <w:proofErr w:type="spellEnd"/>
+          </w:p>
+        </w:tc>
+        <w:tc>
+          <w:tcPr>
+            <w:tcW w:w="1057" w:type="dxa"/>
             <w:tcBorders>
               <w:top w:val="single" w:sz="4" w:space="0" w:color="B7C2D6"/>
               <w:left w:val="single" w:sz="4" w:space="0" w:color="B7C2D6"/>
@@ -1510,62 +1535,62 @@
       <w:tr>
         <w:tc>
           <w:tcPr>
-            <w:tcW w:w="2000" w:type="dxa"/>
-            <w:tcBorders>
-              <w:top w:val="single" w:sz="4" w:space="0" w:color="B7C2D6"/>
-              <w:left w:val="single" w:sz="4" w:space="0" w:color="B7C2D6"/>
-              <w:bottom w:val="single" w:sz="4" w:space="0" w:color="B7C2D6"/>
-              <w:right w:val="single" w:sz="4" w:space="0" w:color="B7C2D6"/>
-            </w:tcBorders>
-            <w:tcMar>
-              <w:top w:w="80" w:type="dxa"/>
-              <w:left w:w="130" w:type="dxa"/>
-              <w:bottom w:w="80" w:type="dxa"/>
-              <w:right w:w="130" w:type="dxa"/>
-            </w:tcMar>
-            <w:vAlign w:val="center"/>
-          </w:tcPr>
-          <w:p>
-            <w:proofErr w:type="spellStart"/>
-            <w:r>
-              <w:t>Nombre</w:t>
-            </w:r>
-            <w:proofErr w:type="spellEnd"/>
-          </w:p>
-        </w:tc>
-        <w:tc>
-          <w:tcPr>
-            <w:tcW w:w="3080" w:type="dxa"/>
-            <w:tcBorders>
-              <w:top w:val="single" w:sz="4" w:space="0" w:color="B7C2D6"/>
-              <w:left w:val="single" w:sz="4" w:space="0" w:color="B7C2D6"/>
-              <w:bottom w:val="single" w:sz="4" w:space="0" w:color="B7C2D6"/>
-              <w:right w:val="single" w:sz="4" w:space="0" w:color="B7C2D6"/>
-            </w:tcBorders>
-            <w:tcMar>
-              <w:top w:w="80" w:type="dxa"/>
-              <w:left w:w="130" w:type="dxa"/>
-              <w:bottom w:w="80" w:type="dxa"/>
-              <w:right w:w="130" w:type="dxa"/>
-            </w:tcMar>
-            <w:vAlign w:val="center"/>
-          </w:tcPr>
-          <w:p>
-            <w:proofErr w:type="spellStart"/>
-            <w:r>
-              <w:t>Nombre</w:t>
-            </w:r>
-            <w:proofErr w:type="spellEnd"/>
-            <w:r>
-              <w:t xml:space="preserve"> al que </w:t>
-            </w:r>
-            <w:proofErr w:type="spellStart"/>
-            <w:r>
-              <w:t>responde</w:t>
-            </w:r>
-            <w:proofErr w:type="spellEnd"/>
-            <w:r>
-              <w:t xml:space="preserve"> la </w:t>
+            <w:tcW w:w="2114" w:type="dxa"/>
+            <w:tcBorders>
+              <w:top w:val="single" w:sz="4" w:space="0" w:color="B7C2D6"/>
+              <w:left w:val="single" w:sz="4" w:space="0" w:color="B7C2D6"/>
+              <w:bottom w:val="single" w:sz="4" w:space="0" w:color="B7C2D6"/>
+              <w:right w:val="single" w:sz="4" w:space="0" w:color="B7C2D6"/>
+            </w:tcBorders>
+            <w:tcMar>
+              <w:top w:w="80" w:type="dxa"/>
+              <w:left w:w="130" w:type="dxa"/>
+              <w:bottom w:w="80" w:type="dxa"/>
+              <w:right w:w="130" w:type="dxa"/>
+            </w:tcMar>
+            <w:vAlign w:val="center"/>
+          </w:tcPr>
+          <w:p>
+            <w:proofErr w:type="spellStart"/>
+            <w:r>
+              <w:t>Especie</w:t>
+            </w:r>
+            <w:proofErr w:type="spellEnd"/>
+          </w:p>
+        </w:tc>
+        <w:tc>
+          <w:tcPr>
+            <w:tcW w:w="3255" w:type="dxa"/>
+            <w:tcBorders>
+              <w:top w:val="single" w:sz="4" w:space="0" w:color="B7C2D6"/>
+              <w:left w:val="single" w:sz="4" w:space="0" w:color="B7C2D6"/>
+              <w:bottom w:val="single" w:sz="4" w:space="0" w:color="B7C2D6"/>
+              <w:right w:val="single" w:sz="4" w:space="0" w:color="B7C2D6"/>
+            </w:tcBorders>
+            <w:tcMar>
+              <w:top w:w="80" w:type="dxa"/>
+              <w:left w:w="130" w:type="dxa"/>
+              <w:bottom w:w="80" w:type="dxa"/>
+              <w:right w:w="130" w:type="dxa"/>
+            </w:tcMar>
+            <w:vAlign w:val="center"/>
+          </w:tcPr>
+          <w:p>
+            <w:proofErr w:type="spellStart"/>
+            <w:r>
+              <w:t>Identifica</w:t>
+            </w:r>
+            <w:proofErr w:type="spellEnd"/>
+            <w:r>
+              <w:t xml:space="preserve"> que </w:t>
+            </w:r>
+            <w:proofErr w:type="spellStart"/>
+            <w:r>
+              <w:t>especie</w:t>
+            </w:r>
+            <w:proofErr w:type="spellEnd"/>
+            <w:r>
+              <w:t xml:space="preserve"> es la </w:t>
             </w:r>
             <w:proofErr w:type="spellStart"/>
             <w:r>
@@ -1577,30 +1602,22 @@
             </w:r>
             <w:proofErr w:type="spellStart"/>
             <w:r>
-              <w:t>cuando</w:t>
-            </w:r>
-            <w:proofErr w:type="spellEnd"/>
-            <w:r>
-              <w:t xml:space="preserve"> es </w:t>
-            </w:r>
-            <w:proofErr w:type="spellStart"/>
-            <w:r>
-              <w:t>llamado</w:t>
-            </w:r>
-            <w:proofErr w:type="spellEnd"/>
-            <w:r>
-              <w:t xml:space="preserve"> por </w:t>
-            </w:r>
-            <w:proofErr w:type="spellStart"/>
-            <w:r>
-              <w:t>este</w:t>
-            </w:r>
-            <w:proofErr w:type="spellEnd"/>
-          </w:p>
-        </w:tc>
-        <w:tc>
-          <w:tcPr>
-            <w:tcW w:w="1800" w:type="dxa"/>
+              <w:t>en</w:t>
+            </w:r>
+            <w:proofErr w:type="spellEnd"/>
+            <w:r>
+              <w:t xml:space="preserve"> </w:t>
+            </w:r>
+            <w:proofErr w:type="spellStart"/>
+            <w:r>
+              <w:t>cuestion</w:t>
+            </w:r>
+            <w:proofErr w:type="spellEnd"/>
+          </w:p>
+        </w:tc>
+        <w:tc>
+          <w:tcPr>
+            <w:tcW w:w="1439" w:type="dxa"/>
             <w:tcBorders>
               <w:top w:val="single" w:sz="4" w:space="0" w:color="B7C2D6"/>
               <w:left w:val="single" w:sz="4" w:space="0" w:color="B7C2D6"/>
@@ -1625,51 +1642,59 @@
         </w:tc>
         <w:tc>
           <w:tcPr>
-            <w:tcW w:w="2200" w:type="dxa"/>
-            <w:tcBorders>
-              <w:top w:val="single" w:sz="4" w:space="0" w:color="B7C2D6"/>
-              <w:left w:val="single" w:sz="4" w:space="0" w:color="B7C2D6"/>
-              <w:bottom w:val="single" w:sz="4" w:space="0" w:color="B7C2D6"/>
-              <w:right w:val="single" w:sz="4" w:space="0" w:color="B7C2D6"/>
-            </w:tcBorders>
-            <w:tcMar>
-              <w:top w:w="80" w:type="dxa"/>
-              <w:left w:w="130" w:type="dxa"/>
-              <w:bottom w:w="80" w:type="dxa"/>
-              <w:right w:w="130" w:type="dxa"/>
-            </w:tcMar>
-            <w:vAlign w:val="center"/>
-          </w:tcPr>
-          <w:p>
-            <w:r>
-              <w:t xml:space="preserve">Tiene que </w:t>
-            </w:r>
-            <w:proofErr w:type="spellStart"/>
-            <w:r>
-              <w:t>poseer</w:t>
-            </w:r>
-            <w:proofErr w:type="spellEnd"/>
-            <w:r>
-              <w:t xml:space="preserve"> de un </w:t>
-            </w:r>
-            <w:proofErr w:type="spellStart"/>
-            <w:r>
-              <w:t>minimo</w:t>
-            </w:r>
-            <w:proofErr w:type="spellEnd"/>
-            <w:r>
-              <w:t xml:space="preserve"> de 3 </w:t>
-            </w:r>
-            <w:proofErr w:type="spellStart"/>
-            <w:r>
-              <w:t>caracteres</w:t>
-            </w:r>
-            <w:proofErr w:type="spellEnd"/>
-          </w:p>
-        </w:tc>
-        <w:tc>
-          <w:tcPr>
-            <w:tcW w:w="1000" w:type="dxa"/>
+            <w:tcW w:w="2325" w:type="dxa"/>
+            <w:tcBorders>
+              <w:top w:val="single" w:sz="4" w:space="0" w:color="B7C2D6"/>
+              <w:left w:val="single" w:sz="4" w:space="0" w:color="B7C2D6"/>
+              <w:bottom w:val="single" w:sz="4" w:space="0" w:color="B7C2D6"/>
+              <w:right w:val="single" w:sz="4" w:space="0" w:color="B7C2D6"/>
+            </w:tcBorders>
+            <w:tcMar>
+              <w:top w:w="80" w:type="dxa"/>
+              <w:left w:w="130" w:type="dxa"/>
+              <w:bottom w:w="80" w:type="dxa"/>
+              <w:right w:w="130" w:type="dxa"/>
+            </w:tcMar>
+            <w:vAlign w:val="center"/>
+          </w:tcPr>
+          <w:p>
+            <w:r>
+              <w:t xml:space="preserve">Debe </w:t>
+            </w:r>
+            <w:proofErr w:type="spellStart"/>
+            <w:r>
+              <w:t>corresponder</w:t>
+            </w:r>
+            <w:proofErr w:type="spellEnd"/>
+            <w:r>
+              <w:t xml:space="preserve"> a una </w:t>
+            </w:r>
+            <w:proofErr w:type="spellStart"/>
+            <w:r>
+              <w:t>especie</w:t>
+            </w:r>
+            <w:proofErr w:type="spellEnd"/>
+            <w:r>
+              <w:t xml:space="preserve"> </w:t>
+            </w:r>
+            <w:proofErr w:type="spellStart"/>
+            <w:r>
+              <w:t>ya</w:t>
+            </w:r>
+            <w:proofErr w:type="spellEnd"/>
+            <w:r>
+              <w:t xml:space="preserve"> </w:t>
+            </w:r>
+            <w:proofErr w:type="spellStart"/>
+            <w:r>
+              <w:t>existente</w:t>
+            </w:r>
+            <w:proofErr w:type="spellEnd"/>
+          </w:p>
+        </w:tc>
+        <w:tc>
+          <w:tcPr>
+            <w:tcW w:w="1057" w:type="dxa"/>
             <w:tcBorders>
               <w:top w:val="single" w:sz="4" w:space="0" w:color="B7C2D6"/>
               <w:left w:val="single" w:sz="4" w:space="0" w:color="B7C2D6"/>
@@ -1694,62 +1719,70 @@
       <w:tr>
         <w:tc>
           <w:tcPr>
-            <w:tcW w:w="2000" w:type="dxa"/>
-            <w:tcBorders>
-              <w:top w:val="single" w:sz="4" w:space="0" w:color="B7C2D6"/>
-              <w:left w:val="single" w:sz="4" w:space="0" w:color="B7C2D6"/>
-              <w:bottom w:val="single" w:sz="4" w:space="0" w:color="B7C2D6"/>
-              <w:right w:val="single" w:sz="4" w:space="0" w:color="B7C2D6"/>
-            </w:tcBorders>
-            <w:tcMar>
-              <w:top w:w="80" w:type="dxa"/>
-              <w:left w:w="130" w:type="dxa"/>
-              <w:bottom w:w="80" w:type="dxa"/>
-              <w:right w:w="130" w:type="dxa"/>
-            </w:tcMar>
-            <w:vAlign w:val="center"/>
-          </w:tcPr>
-          <w:p>
-            <w:proofErr w:type="spellStart"/>
-            <w:r>
-              <w:t>Especie</w:t>
-            </w:r>
-            <w:proofErr w:type="spellEnd"/>
-          </w:p>
-        </w:tc>
-        <w:tc>
-          <w:tcPr>
-            <w:tcW w:w="3080" w:type="dxa"/>
-            <w:tcBorders>
-              <w:top w:val="single" w:sz="4" w:space="0" w:color="B7C2D6"/>
-              <w:left w:val="single" w:sz="4" w:space="0" w:color="B7C2D6"/>
-              <w:bottom w:val="single" w:sz="4" w:space="0" w:color="B7C2D6"/>
-              <w:right w:val="single" w:sz="4" w:space="0" w:color="B7C2D6"/>
-            </w:tcBorders>
-            <w:tcMar>
-              <w:top w:w="80" w:type="dxa"/>
-              <w:left w:w="130" w:type="dxa"/>
-              <w:bottom w:w="80" w:type="dxa"/>
-              <w:right w:w="130" w:type="dxa"/>
-            </w:tcMar>
-            <w:vAlign w:val="center"/>
-          </w:tcPr>
-          <w:p>
-            <w:proofErr w:type="spellStart"/>
-            <w:r>
-              <w:t>Identifica</w:t>
-            </w:r>
-            <w:proofErr w:type="spellEnd"/>
-            <w:r>
-              <w:t xml:space="preserve"> que </w:t>
-            </w:r>
-            <w:proofErr w:type="spellStart"/>
-            <w:r>
-              <w:t>especie</w:t>
-            </w:r>
-            <w:proofErr w:type="spellEnd"/>
-            <w:r>
-              <w:t xml:space="preserve"> es la </w:t>
+            <w:tcW w:w="2114" w:type="dxa"/>
+            <w:tcBorders>
+              <w:top w:val="single" w:sz="4" w:space="0" w:color="B7C2D6"/>
+              <w:left w:val="single" w:sz="4" w:space="0" w:color="B7C2D6"/>
+              <w:bottom w:val="single" w:sz="4" w:space="0" w:color="B7C2D6"/>
+              <w:right w:val="single" w:sz="4" w:space="0" w:color="B7C2D6"/>
+            </w:tcBorders>
+            <w:tcMar>
+              <w:top w:w="80" w:type="dxa"/>
+              <w:left w:w="130" w:type="dxa"/>
+              <w:bottom w:w="80" w:type="dxa"/>
+              <w:right w:w="130" w:type="dxa"/>
+            </w:tcMar>
+            <w:vAlign w:val="center"/>
+          </w:tcPr>
+          <w:p>
+            <w:proofErr w:type="spellStart"/>
+            <w:r>
+              <w:t>Edad</w:t>
+            </w:r>
+            <w:proofErr w:type="spellEnd"/>
+          </w:p>
+        </w:tc>
+        <w:tc>
+          <w:tcPr>
+            <w:tcW w:w="3255" w:type="dxa"/>
+            <w:tcBorders>
+              <w:top w:val="single" w:sz="4" w:space="0" w:color="B7C2D6"/>
+              <w:left w:val="single" w:sz="4" w:space="0" w:color="B7C2D6"/>
+              <w:bottom w:val="single" w:sz="4" w:space="0" w:color="B7C2D6"/>
+              <w:right w:val="single" w:sz="4" w:space="0" w:color="B7C2D6"/>
+            </w:tcBorders>
+            <w:tcMar>
+              <w:top w:w="80" w:type="dxa"/>
+              <w:left w:w="130" w:type="dxa"/>
+              <w:bottom w:w="80" w:type="dxa"/>
+              <w:right w:w="130" w:type="dxa"/>
+            </w:tcMar>
+            <w:vAlign w:val="center"/>
+          </w:tcPr>
+          <w:p>
+            <w:proofErr w:type="spellStart"/>
+            <w:r>
+              <w:t>Numero</w:t>
+            </w:r>
+            <w:proofErr w:type="spellEnd"/>
+            <w:r>
+              <w:t xml:space="preserve"> de </w:t>
+            </w:r>
+            <w:proofErr w:type="spellStart"/>
+            <w:r>
+              <w:t>Años</w:t>
+            </w:r>
+            <w:proofErr w:type="spellEnd"/>
+            <w:r>
+              <w:t xml:space="preserve"> el </w:t>
+            </w:r>
+            <w:proofErr w:type="spellStart"/>
+            <w:r>
+              <w:t>cual</w:t>
+            </w:r>
+            <w:proofErr w:type="spellEnd"/>
+            <w:r>
+              <w:t xml:space="preserve"> la </w:t>
             </w:r>
             <w:proofErr w:type="spellStart"/>
             <w:r>
@@ -1757,103 +1790,85 @@
             </w:r>
             <w:proofErr w:type="spellEnd"/>
             <w:r>
+              <w:t xml:space="preserve"> ha </w:t>
+            </w:r>
+            <w:proofErr w:type="spellStart"/>
+            <w:r>
+              <w:t>tenido</w:t>
+            </w:r>
+            <w:proofErr w:type="spellEnd"/>
+            <w:r>
               <w:t xml:space="preserve"> </w:t>
             </w:r>
             <w:proofErr w:type="spellStart"/>
             <w:r>
-              <w:t>en</w:t>
-            </w:r>
-            <w:proofErr w:type="spellEnd"/>
-            <w:r>
-              <w:t xml:space="preserve"> </w:t>
-            </w:r>
-            <w:proofErr w:type="spellStart"/>
-            <w:r>
-              <w:t>cuestion</w:t>
-            </w:r>
-            <w:proofErr w:type="spellEnd"/>
-          </w:p>
-        </w:tc>
-        <w:tc>
-          <w:tcPr>
-            <w:tcW w:w="1800" w:type="dxa"/>
-            <w:tcBorders>
-              <w:top w:val="single" w:sz="4" w:space="0" w:color="B7C2D6"/>
-              <w:left w:val="single" w:sz="4" w:space="0" w:color="B7C2D6"/>
-              <w:bottom w:val="single" w:sz="4" w:space="0" w:color="B7C2D6"/>
-              <w:right w:val="single" w:sz="4" w:space="0" w:color="B7C2D6"/>
-            </w:tcBorders>
-            <w:tcMar>
-              <w:top w:w="80" w:type="dxa"/>
-              <w:left w:w="130" w:type="dxa"/>
-              <w:bottom w:w="80" w:type="dxa"/>
-              <w:right w:w="130" w:type="dxa"/>
-            </w:tcMar>
-            <w:vAlign w:val="center"/>
-          </w:tcPr>
-          <w:p>
-            <w:proofErr w:type="spellStart"/>
-            <w:r>
-              <w:t>Texto</w:t>
-            </w:r>
-            <w:proofErr w:type="spellEnd"/>
-          </w:p>
-        </w:tc>
-        <w:tc>
-          <w:tcPr>
-            <w:tcW w:w="2200" w:type="dxa"/>
-            <w:tcBorders>
-              <w:top w:val="single" w:sz="4" w:space="0" w:color="B7C2D6"/>
-              <w:left w:val="single" w:sz="4" w:space="0" w:color="B7C2D6"/>
-              <w:bottom w:val="single" w:sz="4" w:space="0" w:color="B7C2D6"/>
-              <w:right w:val="single" w:sz="4" w:space="0" w:color="B7C2D6"/>
-            </w:tcBorders>
-            <w:tcMar>
-              <w:top w:w="80" w:type="dxa"/>
-              <w:left w:w="130" w:type="dxa"/>
-              <w:bottom w:w="80" w:type="dxa"/>
-              <w:right w:w="130" w:type="dxa"/>
-            </w:tcMar>
-            <w:vAlign w:val="center"/>
-          </w:tcPr>
-          <w:p>
-            <w:r>
-              <w:t xml:space="preserve">Debe </w:t>
-            </w:r>
-            <w:proofErr w:type="spellStart"/>
-            <w:r>
-              <w:t>corresponder</w:t>
-            </w:r>
-            <w:proofErr w:type="spellEnd"/>
-            <w:r>
-              <w:t xml:space="preserve"> a una </w:t>
-            </w:r>
-            <w:proofErr w:type="spellStart"/>
-            <w:r>
-              <w:t>especie</w:t>
-            </w:r>
-            <w:proofErr w:type="spellEnd"/>
-            <w:r>
-              <w:t xml:space="preserve"> </w:t>
-            </w:r>
-            <w:proofErr w:type="spellStart"/>
-            <w:r>
-              <w:t>ya</w:t>
-            </w:r>
-            <w:proofErr w:type="spellEnd"/>
-            <w:r>
-              <w:t xml:space="preserve"> </w:t>
-            </w:r>
-            <w:proofErr w:type="spellStart"/>
-            <w:r>
-              <w:t>existente</w:t>
-            </w:r>
-            <w:proofErr w:type="spellEnd"/>
-          </w:p>
-        </w:tc>
-        <w:tc>
-          <w:tcPr>
-            <w:tcW w:w="1000" w:type="dxa"/>
+              <w:t>vida</w:t>
+            </w:r>
+            <w:proofErr w:type="spellEnd"/>
+          </w:p>
+        </w:tc>
+        <w:tc>
+          <w:tcPr>
+            <w:tcW w:w="1439" w:type="dxa"/>
+            <w:tcBorders>
+              <w:top w:val="single" w:sz="4" w:space="0" w:color="B7C2D6"/>
+              <w:left w:val="single" w:sz="4" w:space="0" w:color="B7C2D6"/>
+              <w:bottom w:val="single" w:sz="4" w:space="0" w:color="B7C2D6"/>
+              <w:right w:val="single" w:sz="4" w:space="0" w:color="B7C2D6"/>
+            </w:tcBorders>
+            <w:tcMar>
+              <w:top w:w="80" w:type="dxa"/>
+              <w:left w:w="130" w:type="dxa"/>
+              <w:bottom w:w="80" w:type="dxa"/>
+              <w:right w:w="130" w:type="dxa"/>
+            </w:tcMar>
+            <w:vAlign w:val="center"/>
+          </w:tcPr>
+          <w:p>
+            <w:r>
+              <w:t>INT</w:t>
+            </w:r>
+          </w:p>
+        </w:tc>
+        <w:tc>
+          <w:tcPr>
+            <w:tcW w:w="2325" w:type="dxa"/>
+            <w:tcBorders>
+              <w:top w:val="single" w:sz="4" w:space="0" w:color="B7C2D6"/>
+              <w:left w:val="single" w:sz="4" w:space="0" w:color="B7C2D6"/>
+              <w:bottom w:val="single" w:sz="4" w:space="0" w:color="B7C2D6"/>
+              <w:right w:val="single" w:sz="4" w:space="0" w:color="B7C2D6"/>
+            </w:tcBorders>
+            <w:tcMar>
+              <w:top w:w="80" w:type="dxa"/>
+              <w:left w:w="130" w:type="dxa"/>
+              <w:bottom w:w="80" w:type="dxa"/>
+              <w:right w:w="130" w:type="dxa"/>
+            </w:tcMar>
+            <w:vAlign w:val="center"/>
+          </w:tcPr>
+          <w:p>
+            <w:r>
+              <w:t xml:space="preserve">No </w:t>
+            </w:r>
+            <w:proofErr w:type="spellStart"/>
+            <w:r>
+              <w:t>puede</w:t>
+            </w:r>
+            <w:proofErr w:type="spellEnd"/>
+            <w:r>
+              <w:t xml:space="preserve"> ser </w:t>
+            </w:r>
+            <w:proofErr w:type="spellStart"/>
+            <w:r>
+              <w:t>negativo</w:t>
+            </w:r>
+            <w:proofErr w:type="spellEnd"/>
+          </w:p>
+        </w:tc>
+        <w:tc>
+          <w:tcPr>
+            <w:tcW w:w="1057" w:type="dxa"/>
             <w:tcBorders>
               <w:top w:val="single" w:sz="4" w:space="0" w:color="B7C2D6"/>
               <w:left w:val="single" w:sz="4" w:space="0" w:color="B7C2D6"/>
@@ -1878,50 +1893,50 @@
       <w:tr>
         <w:tc>
           <w:tcPr>
-            <w:tcW w:w="2000" w:type="dxa"/>
-            <w:tcBorders>
-              <w:top w:val="single" w:sz="4" w:space="0" w:color="B7C2D6"/>
-              <w:left w:val="single" w:sz="4" w:space="0" w:color="B7C2D6"/>
-              <w:bottom w:val="single" w:sz="4" w:space="0" w:color="B7C2D6"/>
-              <w:right w:val="single" w:sz="4" w:space="0" w:color="B7C2D6"/>
-            </w:tcBorders>
-            <w:tcMar>
-              <w:top w:w="80" w:type="dxa"/>
-              <w:left w:w="130" w:type="dxa"/>
-              <w:bottom w:w="80" w:type="dxa"/>
-              <w:right w:w="130" w:type="dxa"/>
-            </w:tcMar>
-            <w:vAlign w:val="center"/>
-          </w:tcPr>
-          <w:p>
-            <w:proofErr w:type="spellStart"/>
-            <w:r>
-              <w:t>Edad</w:t>
-            </w:r>
-            <w:proofErr w:type="spellEnd"/>
-          </w:p>
-        </w:tc>
-        <w:tc>
-          <w:tcPr>
-            <w:tcW w:w="3080" w:type="dxa"/>
-            <w:tcBorders>
-              <w:top w:val="single" w:sz="4" w:space="0" w:color="B7C2D6"/>
-              <w:left w:val="single" w:sz="4" w:space="0" w:color="B7C2D6"/>
-              <w:bottom w:val="single" w:sz="4" w:space="0" w:color="B7C2D6"/>
-              <w:right w:val="single" w:sz="4" w:space="0" w:color="B7C2D6"/>
-            </w:tcBorders>
-            <w:tcMar>
-              <w:top w:w="80" w:type="dxa"/>
-              <w:left w:w="130" w:type="dxa"/>
-              <w:bottom w:w="80" w:type="dxa"/>
-              <w:right w:w="130" w:type="dxa"/>
-            </w:tcMar>
-            <w:vAlign w:val="center"/>
-          </w:tcPr>
-          <w:p>
-            <w:proofErr w:type="spellStart"/>
-            <w:r>
-              <w:t>Numero</w:t>
+            <w:tcW w:w="2114" w:type="dxa"/>
+            <w:tcBorders>
+              <w:top w:val="single" w:sz="4" w:space="0" w:color="B7C2D6"/>
+              <w:left w:val="single" w:sz="4" w:space="0" w:color="B7C2D6"/>
+              <w:bottom w:val="single" w:sz="4" w:space="0" w:color="B7C2D6"/>
+              <w:right w:val="single" w:sz="4" w:space="0" w:color="B7C2D6"/>
+            </w:tcBorders>
+            <w:tcMar>
+              <w:top w:w="80" w:type="dxa"/>
+              <w:left w:w="130" w:type="dxa"/>
+              <w:bottom w:w="80" w:type="dxa"/>
+              <w:right w:w="130" w:type="dxa"/>
+            </w:tcMar>
+            <w:vAlign w:val="center"/>
+          </w:tcPr>
+          <w:p>
+            <w:proofErr w:type="spellStart"/>
+            <w:r>
+              <w:t>Tamaño</w:t>
+            </w:r>
+            <w:proofErr w:type="spellEnd"/>
+          </w:p>
+        </w:tc>
+        <w:tc>
+          <w:tcPr>
+            <w:tcW w:w="3255" w:type="dxa"/>
+            <w:tcBorders>
+              <w:top w:val="single" w:sz="4" w:space="0" w:color="B7C2D6"/>
+              <w:left w:val="single" w:sz="4" w:space="0" w:color="B7C2D6"/>
+              <w:bottom w:val="single" w:sz="4" w:space="0" w:color="B7C2D6"/>
+              <w:right w:val="single" w:sz="4" w:space="0" w:color="B7C2D6"/>
+            </w:tcBorders>
+            <w:tcMar>
+              <w:top w:w="80" w:type="dxa"/>
+              <w:left w:w="130" w:type="dxa"/>
+              <w:bottom w:w="80" w:type="dxa"/>
+              <w:right w:w="130" w:type="dxa"/>
+            </w:tcMar>
+            <w:vAlign w:val="center"/>
+          </w:tcPr>
+          <w:p>
+            <w:proofErr w:type="spellStart"/>
+            <w:r>
+              <w:t>Cantidad</w:t>
             </w:r>
             <w:proofErr w:type="spellEnd"/>
             <w:r>
@@ -1929,15 +1944,15 @@
             </w:r>
             <w:proofErr w:type="spellStart"/>
             <w:r>
-              <w:t>Años</w:t>
-            </w:r>
-            <w:proofErr w:type="spellEnd"/>
-            <w:r>
-              <w:t xml:space="preserve"> el </w:t>
-            </w:r>
-            <w:proofErr w:type="spellStart"/>
-            <w:r>
-              <w:t>cual</w:t>
+              <w:t>espacio</w:t>
+            </w:r>
+            <w:proofErr w:type="spellEnd"/>
+            <w:r>
+              <w:t xml:space="preserve"> que </w:t>
+            </w:r>
+            <w:proofErr w:type="spellStart"/>
+            <w:r>
+              <w:t>ocupa</w:t>
             </w:r>
             <w:proofErr w:type="spellEnd"/>
             <w:r>
@@ -1948,12 +1963,73 @@
               <w:t>mascota</w:t>
             </w:r>
             <w:proofErr w:type="spellEnd"/>
-            <w:r>
-              <w:t xml:space="preserve"> ha </w:t>
-            </w:r>
-            <w:proofErr w:type="spellStart"/>
-            <w:r>
-              <w:t>tenido</w:t>
+          </w:p>
+        </w:tc>
+        <w:tc>
+          <w:tcPr>
+            <w:tcW w:w="1439" w:type="dxa"/>
+            <w:tcBorders>
+              <w:top w:val="single" w:sz="4" w:space="0" w:color="B7C2D6"/>
+              <w:left w:val="single" w:sz="4" w:space="0" w:color="B7C2D6"/>
+              <w:bottom w:val="single" w:sz="4" w:space="0" w:color="B7C2D6"/>
+              <w:right w:val="single" w:sz="4" w:space="0" w:color="B7C2D6"/>
+            </w:tcBorders>
+            <w:tcMar>
+              <w:top w:w="80" w:type="dxa"/>
+              <w:left w:w="130" w:type="dxa"/>
+              <w:bottom w:w="80" w:type="dxa"/>
+              <w:right w:w="130" w:type="dxa"/>
+            </w:tcMar>
+            <w:vAlign w:val="center"/>
+          </w:tcPr>
+          <w:p>
+            <w:proofErr w:type="spellStart"/>
+            <w:r>
+              <w:t>Texto</w:t>
+            </w:r>
+            <w:proofErr w:type="spellEnd"/>
+          </w:p>
+        </w:tc>
+        <w:tc>
+          <w:tcPr>
+            <w:tcW w:w="2325" w:type="dxa"/>
+            <w:tcBorders>
+              <w:top w:val="single" w:sz="4" w:space="0" w:color="B7C2D6"/>
+              <w:left w:val="single" w:sz="4" w:space="0" w:color="B7C2D6"/>
+              <w:bottom w:val="single" w:sz="4" w:space="0" w:color="B7C2D6"/>
+              <w:right w:val="single" w:sz="4" w:space="0" w:color="B7C2D6"/>
+            </w:tcBorders>
+            <w:tcMar>
+              <w:top w:w="80" w:type="dxa"/>
+              <w:left w:w="130" w:type="dxa"/>
+              <w:bottom w:w="80" w:type="dxa"/>
+              <w:right w:w="130" w:type="dxa"/>
+            </w:tcMar>
+            <w:vAlign w:val="center"/>
+          </w:tcPr>
+          <w:p>
+            <w:r>
+              <w:t xml:space="preserve">Solo </w:t>
+            </w:r>
+            <w:proofErr w:type="spellStart"/>
+            <w:r>
+              <w:t>puede</w:t>
+            </w:r>
+            <w:proofErr w:type="spellEnd"/>
+            <w:r>
+              <w:t xml:space="preserve"> ser </w:t>
+            </w:r>
+            <w:proofErr w:type="spellStart"/>
+            <w:r>
+              <w:t>alguna</w:t>
+            </w:r>
+            <w:proofErr w:type="spellEnd"/>
+            <w:r>
+              <w:t xml:space="preserve"> de las </w:t>
+            </w:r>
+            <w:proofErr w:type="spellStart"/>
+            <w:r>
+              <w:t>especificadas</w:t>
             </w:r>
             <w:proofErr w:type="spellEnd"/>
             <w:r>
@@ -1961,73 +2037,30 @@
             </w:r>
             <w:proofErr w:type="spellStart"/>
             <w:r>
-              <w:t>vida</w:t>
-            </w:r>
-            <w:proofErr w:type="spellEnd"/>
-          </w:p>
-        </w:tc>
-        <w:tc>
-          <w:tcPr>
-            <w:tcW w:w="1800" w:type="dxa"/>
-            <w:tcBorders>
-              <w:top w:val="single" w:sz="4" w:space="0" w:color="B7C2D6"/>
-              <w:left w:val="single" w:sz="4" w:space="0" w:color="B7C2D6"/>
-              <w:bottom w:val="single" w:sz="4" w:space="0" w:color="B7C2D6"/>
-              <w:right w:val="single" w:sz="4" w:space="0" w:color="B7C2D6"/>
-            </w:tcBorders>
-            <w:tcMar>
-              <w:top w:w="80" w:type="dxa"/>
-              <w:left w:w="130" w:type="dxa"/>
-              <w:bottom w:w="80" w:type="dxa"/>
-              <w:right w:w="130" w:type="dxa"/>
-            </w:tcMar>
-            <w:vAlign w:val="center"/>
-          </w:tcPr>
-          <w:p>
-            <w:r>
-              <w:t>INT</w:t>
-            </w:r>
-          </w:p>
-        </w:tc>
-        <w:tc>
-          <w:tcPr>
-            <w:tcW w:w="2200" w:type="dxa"/>
-            <w:tcBorders>
-              <w:top w:val="single" w:sz="4" w:space="0" w:color="B7C2D6"/>
-              <w:left w:val="single" w:sz="4" w:space="0" w:color="B7C2D6"/>
-              <w:bottom w:val="single" w:sz="4" w:space="0" w:color="B7C2D6"/>
-              <w:right w:val="single" w:sz="4" w:space="0" w:color="B7C2D6"/>
-            </w:tcBorders>
-            <w:tcMar>
-              <w:top w:w="80" w:type="dxa"/>
-              <w:left w:w="130" w:type="dxa"/>
-              <w:bottom w:w="80" w:type="dxa"/>
-              <w:right w:w="130" w:type="dxa"/>
-            </w:tcMar>
-            <w:vAlign w:val="center"/>
-          </w:tcPr>
-          <w:p>
-            <w:r>
-              <w:t xml:space="preserve">No </w:t>
-            </w:r>
-            <w:proofErr w:type="spellStart"/>
-            <w:r>
-              <w:t>puede</w:t>
-            </w:r>
-            <w:proofErr w:type="spellEnd"/>
-            <w:r>
-              <w:t xml:space="preserve"> ser </w:t>
-            </w:r>
-            <w:proofErr w:type="spellStart"/>
-            <w:r>
-              <w:t>negativo</w:t>
-            </w:r>
-            <w:proofErr w:type="spellEnd"/>
-          </w:p>
-        </w:tc>
-        <w:tc>
-          <w:tcPr>
-            <w:tcW w:w="1000" w:type="dxa"/>
+              <w:t>en</w:t>
+            </w:r>
+            <w:proofErr w:type="spellEnd"/>
+            <w:r>
+              <w:t xml:space="preserve"> las </w:t>
+            </w:r>
+            <w:proofErr w:type="spellStart"/>
+            <w:r>
+              <w:t>reglas</w:t>
+            </w:r>
+            <w:proofErr w:type="spellEnd"/>
+            <w:r>
+              <w:t xml:space="preserve"> de </w:t>
+            </w:r>
+            <w:proofErr w:type="spellStart"/>
+            <w:r>
+              <w:t>negocio</w:t>
+            </w:r>
+            <w:proofErr w:type="spellEnd"/>
+          </w:p>
+        </w:tc>
+        <w:tc>
+          <w:tcPr>
+            <w:tcW w:w="1057" w:type="dxa"/>
             <w:tcBorders>
               <w:top w:val="single" w:sz="4" w:space="0" w:color="B7C2D6"/>
               <w:left w:val="single" w:sz="4" w:space="0" w:color="B7C2D6"/>
@@ -2052,58 +2085,93 @@
       <w:tr>
         <w:tc>
           <w:tcPr>
-            <w:tcW w:w="2000" w:type="dxa"/>
-            <w:tcBorders>
-              <w:top w:val="single" w:sz="4" w:space="0" w:color="B7C2D6"/>
-              <w:left w:val="single" w:sz="4" w:space="0" w:color="B7C2D6"/>
-              <w:bottom w:val="single" w:sz="4" w:space="0" w:color="B7C2D6"/>
-              <w:right w:val="single" w:sz="4" w:space="0" w:color="B7C2D6"/>
-            </w:tcBorders>
-            <w:tcMar>
-              <w:top w:w="80" w:type="dxa"/>
-              <w:left w:w="130" w:type="dxa"/>
-              <w:bottom w:w="80" w:type="dxa"/>
-              <w:right w:w="130" w:type="dxa"/>
-            </w:tcMar>
-            <w:vAlign w:val="center"/>
-          </w:tcPr>
-          <w:p>
-            <w:proofErr w:type="spellStart"/>
-            <w:r>
-              <w:t>Tamaño</w:t>
-            </w:r>
-            <w:proofErr w:type="spellEnd"/>
-          </w:p>
-        </w:tc>
-        <w:tc>
-          <w:tcPr>
-            <w:tcW w:w="3080" w:type="dxa"/>
-            <w:tcBorders>
-              <w:top w:val="single" w:sz="4" w:space="0" w:color="B7C2D6"/>
-              <w:left w:val="single" w:sz="4" w:space="0" w:color="B7C2D6"/>
-              <w:bottom w:val="single" w:sz="4" w:space="0" w:color="B7C2D6"/>
-              <w:right w:val="single" w:sz="4" w:space="0" w:color="B7C2D6"/>
-            </w:tcBorders>
-            <w:tcMar>
-              <w:top w:w="80" w:type="dxa"/>
-              <w:left w:w="130" w:type="dxa"/>
-              <w:bottom w:w="80" w:type="dxa"/>
-              <w:right w:w="130" w:type="dxa"/>
-            </w:tcMar>
-            <w:vAlign w:val="center"/>
-          </w:tcPr>
-          <w:p>
-            <w:proofErr w:type="spellStart"/>
-            <w:r>
-              <w:t>Cantidad</w:t>
-            </w:r>
-            <w:proofErr w:type="spellEnd"/>
-            <w:r>
-              <w:t xml:space="preserve"> de </w:t>
-            </w:r>
-            <w:proofErr w:type="spellStart"/>
-            <w:r>
-              <w:t>espacio</w:t>
+            <w:tcW w:w="2114" w:type="dxa"/>
+            <w:tcBorders>
+              <w:top w:val="single" w:sz="4" w:space="0" w:color="B7C2D6"/>
+              <w:left w:val="single" w:sz="4" w:space="0" w:color="B7C2D6"/>
+              <w:bottom w:val="single" w:sz="4" w:space="0" w:color="B7C2D6"/>
+              <w:right w:val="single" w:sz="4" w:space="0" w:color="B7C2D6"/>
+            </w:tcBorders>
+            <w:tcMar>
+              <w:top w:w="80" w:type="dxa"/>
+              <w:left w:w="130" w:type="dxa"/>
+              <w:bottom w:w="80" w:type="dxa"/>
+              <w:right w:w="130" w:type="dxa"/>
+            </w:tcMar>
+            <w:vAlign w:val="center"/>
+          </w:tcPr>
+          <w:p>
+            <w:proofErr w:type="spellStart"/>
+            <w:r>
+              <w:t>Compatibilidad</w:t>
+            </w:r>
+            <w:proofErr w:type="spellEnd"/>
+            <w:r>
+              <w:t xml:space="preserve"> </w:t>
+            </w:r>
+            <w:proofErr w:type="spellStart"/>
+            <w:r>
+              <w:t>Niños</w:t>
+            </w:r>
+            <w:proofErr w:type="spellEnd"/>
+          </w:p>
+        </w:tc>
+        <w:tc>
+          <w:tcPr>
+            <w:tcW w:w="3255" w:type="dxa"/>
+            <w:tcBorders>
+              <w:top w:val="single" w:sz="4" w:space="0" w:color="B7C2D6"/>
+              <w:left w:val="single" w:sz="4" w:space="0" w:color="B7C2D6"/>
+              <w:bottom w:val="single" w:sz="4" w:space="0" w:color="B7C2D6"/>
+              <w:right w:val="single" w:sz="4" w:space="0" w:color="B7C2D6"/>
+            </w:tcBorders>
+            <w:tcMar>
+              <w:top w:w="80" w:type="dxa"/>
+              <w:left w:w="130" w:type="dxa"/>
+              <w:bottom w:w="80" w:type="dxa"/>
+              <w:right w:w="130" w:type="dxa"/>
+            </w:tcMar>
+            <w:vAlign w:val="center"/>
+          </w:tcPr>
+          <w:p>
+            <w:r>
+              <w:t xml:space="preserve">Describe </w:t>
+            </w:r>
+            <w:proofErr w:type="spellStart"/>
+            <w:r>
+              <w:t>si</w:t>
+            </w:r>
+            <w:proofErr w:type="spellEnd"/>
+            <w:r>
+              <w:t xml:space="preserve"> </w:t>
+            </w:r>
+            <w:proofErr w:type="spellStart"/>
+            <w:r>
+              <w:t>esta</w:t>
+            </w:r>
+            <w:proofErr w:type="spellEnd"/>
+            <w:r>
+              <w:t xml:space="preserve"> </w:t>
+            </w:r>
+            <w:proofErr w:type="spellStart"/>
+            <w:r>
+              <w:t>mascota</w:t>
+            </w:r>
+            <w:proofErr w:type="spellEnd"/>
+            <w:r>
+              <w:t xml:space="preserve"> es </w:t>
+            </w:r>
+            <w:proofErr w:type="spellStart"/>
+            <w:r>
+              <w:t>apta</w:t>
+            </w:r>
+            <w:proofErr w:type="spellEnd"/>
+            <w:r>
+              <w:t xml:space="preserve"> para un </w:t>
+            </w:r>
+            <w:proofErr w:type="spellStart"/>
+            <w:r>
+              <w:t>ambiente</w:t>
             </w:r>
             <w:proofErr w:type="spellEnd"/>
             <w:r>
@@ -2111,84 +2179,7 @@
             </w:r>
             <w:proofErr w:type="spellStart"/>
             <w:r>
-              <w:t>ocupa</w:t>
-            </w:r>
-            <w:proofErr w:type="spellEnd"/>
-            <w:r>
-              <w:t xml:space="preserve"> la </w:t>
-            </w:r>
-            <w:proofErr w:type="spellStart"/>
-            <w:r>
-              <w:t>mascota</w:t>
-            </w:r>
-            <w:proofErr w:type="spellEnd"/>
-          </w:p>
-        </w:tc>
-        <w:tc>
-          <w:tcPr>
-            <w:tcW w:w="1800" w:type="dxa"/>
-            <w:tcBorders>
-              <w:top w:val="single" w:sz="4" w:space="0" w:color="B7C2D6"/>
-              <w:left w:val="single" w:sz="4" w:space="0" w:color="B7C2D6"/>
-              <w:bottom w:val="single" w:sz="4" w:space="0" w:color="B7C2D6"/>
-              <w:right w:val="single" w:sz="4" w:space="0" w:color="B7C2D6"/>
-            </w:tcBorders>
-            <w:tcMar>
-              <w:top w:w="80" w:type="dxa"/>
-              <w:left w:w="130" w:type="dxa"/>
-              <w:bottom w:w="80" w:type="dxa"/>
-              <w:right w:w="130" w:type="dxa"/>
-            </w:tcMar>
-            <w:vAlign w:val="center"/>
-          </w:tcPr>
-          <w:p>
-            <w:proofErr w:type="spellStart"/>
-            <w:r>
-              <w:t>Texto</w:t>
-            </w:r>
-            <w:proofErr w:type="spellEnd"/>
-          </w:p>
-        </w:tc>
-        <w:tc>
-          <w:tcPr>
-            <w:tcW w:w="2200" w:type="dxa"/>
-            <w:tcBorders>
-              <w:top w:val="single" w:sz="4" w:space="0" w:color="B7C2D6"/>
-              <w:left w:val="single" w:sz="4" w:space="0" w:color="B7C2D6"/>
-              <w:bottom w:val="single" w:sz="4" w:space="0" w:color="B7C2D6"/>
-              <w:right w:val="single" w:sz="4" w:space="0" w:color="B7C2D6"/>
-            </w:tcBorders>
-            <w:tcMar>
-              <w:top w:w="80" w:type="dxa"/>
-              <w:left w:w="130" w:type="dxa"/>
-              <w:bottom w:w="80" w:type="dxa"/>
-              <w:right w:w="130" w:type="dxa"/>
-            </w:tcMar>
-            <w:vAlign w:val="center"/>
-          </w:tcPr>
-          <w:p>
-            <w:r>
-              <w:t xml:space="preserve">Solo </w:t>
-            </w:r>
-            <w:proofErr w:type="spellStart"/>
-            <w:r>
-              <w:t>puede</w:t>
-            </w:r>
-            <w:proofErr w:type="spellEnd"/>
-            <w:r>
-              <w:t xml:space="preserve"> ser </w:t>
-            </w:r>
-            <w:proofErr w:type="spellStart"/>
-            <w:r>
-              <w:t>alguna</w:t>
-            </w:r>
-            <w:proofErr w:type="spellEnd"/>
-            <w:r>
-              <w:t xml:space="preserve"> de las </w:t>
-            </w:r>
-            <w:proofErr w:type="spellStart"/>
-            <w:r>
-              <w:t>especificadas</w:t>
+              <w:t>contenga</w:t>
             </w:r>
             <w:proofErr w:type="spellEnd"/>
             <w:r>
@@ -2196,30 +2187,113 @@
             </w:r>
             <w:proofErr w:type="spellStart"/>
             <w:r>
-              <w:t>en</w:t>
-            </w:r>
-            <w:proofErr w:type="spellEnd"/>
-            <w:r>
-              <w:t xml:space="preserve"> las </w:t>
-            </w:r>
-            <w:proofErr w:type="spellStart"/>
-            <w:r>
-              <w:t>reglas</w:t>
-            </w:r>
-            <w:proofErr w:type="spellEnd"/>
-            <w:r>
-              <w:t xml:space="preserve"> de </w:t>
-            </w:r>
-            <w:proofErr w:type="spellStart"/>
-            <w:r>
-              <w:t>negocio</w:t>
-            </w:r>
-            <w:proofErr w:type="spellEnd"/>
-          </w:p>
-        </w:tc>
-        <w:tc>
-          <w:tcPr>
-            <w:tcW w:w="1000" w:type="dxa"/>
+              <w:t>niños</w:t>
+            </w:r>
+            <w:proofErr w:type="spellEnd"/>
+            <w:r>
+              <w:t xml:space="preserve"> al </w:t>
+            </w:r>
+            <w:proofErr w:type="spellStart"/>
+            <w:r>
+              <w:t>rededor</w:t>
+            </w:r>
+            <w:proofErr w:type="spellEnd"/>
+          </w:p>
+        </w:tc>
+        <w:tc>
+          <w:tcPr>
+            <w:tcW w:w="1439" w:type="dxa"/>
+            <w:tcBorders>
+              <w:top w:val="single" w:sz="4" w:space="0" w:color="B7C2D6"/>
+              <w:left w:val="single" w:sz="4" w:space="0" w:color="B7C2D6"/>
+              <w:bottom w:val="single" w:sz="4" w:space="0" w:color="B7C2D6"/>
+              <w:right w:val="single" w:sz="4" w:space="0" w:color="B7C2D6"/>
+            </w:tcBorders>
+            <w:tcMar>
+              <w:top w:w="80" w:type="dxa"/>
+              <w:left w:w="130" w:type="dxa"/>
+              <w:bottom w:w="80" w:type="dxa"/>
+              <w:right w:w="130" w:type="dxa"/>
+            </w:tcMar>
+            <w:vAlign w:val="center"/>
+          </w:tcPr>
+          <w:p>
+            <w:r>
+              <w:t>bool</w:t>
+            </w:r>
+          </w:p>
+        </w:tc>
+        <w:tc>
+          <w:tcPr>
+            <w:tcW w:w="2325" w:type="dxa"/>
+            <w:tcBorders>
+              <w:top w:val="single" w:sz="4" w:space="0" w:color="B7C2D6"/>
+              <w:left w:val="single" w:sz="4" w:space="0" w:color="B7C2D6"/>
+              <w:bottom w:val="single" w:sz="4" w:space="0" w:color="B7C2D6"/>
+              <w:right w:val="single" w:sz="4" w:space="0" w:color="B7C2D6"/>
+            </w:tcBorders>
+            <w:tcMar>
+              <w:top w:w="80" w:type="dxa"/>
+              <w:left w:w="130" w:type="dxa"/>
+              <w:bottom w:w="80" w:type="dxa"/>
+              <w:right w:w="130" w:type="dxa"/>
+            </w:tcMar>
+            <w:vAlign w:val="center"/>
+          </w:tcPr>
+          <w:p>
+            <w:r>
+              <w:t xml:space="preserve">Debe </w:t>
+            </w:r>
+            <w:proofErr w:type="spellStart"/>
+            <w:r>
+              <w:t>corresponder</w:t>
+            </w:r>
+            <w:proofErr w:type="spellEnd"/>
+            <w:r>
+              <w:t xml:space="preserve"> al </w:t>
+            </w:r>
+            <w:proofErr w:type="spellStart"/>
+            <w:r>
+              <w:t>resultado</w:t>
+            </w:r>
+            <w:proofErr w:type="spellEnd"/>
+            <w:r>
+              <w:t xml:space="preserve"> dado, al </w:t>
+            </w:r>
+            <w:proofErr w:type="spellStart"/>
+            <w:r>
+              <w:t>someter</w:t>
+            </w:r>
+            <w:proofErr w:type="spellEnd"/>
+            <w:r>
+              <w:t xml:space="preserve"> al animal a un </w:t>
+            </w:r>
+            <w:proofErr w:type="spellStart"/>
+            <w:r>
+              <w:t>ambiente</w:t>
+            </w:r>
+            <w:proofErr w:type="spellEnd"/>
+            <w:r>
+              <w:t xml:space="preserve"> con las </w:t>
+            </w:r>
+            <w:proofErr w:type="spellStart"/>
+            <w:r>
+              <w:t>carateristicas</w:t>
+            </w:r>
+            <w:proofErr w:type="spellEnd"/>
+            <w:r>
+              <w:t xml:space="preserve"> </w:t>
+            </w:r>
+            <w:proofErr w:type="spellStart"/>
+            <w:r>
+              <w:t>mencionadas</w:t>
+            </w:r>
+            <w:proofErr w:type="spellEnd"/>
+          </w:p>
+        </w:tc>
+        <w:tc>
+          <w:tcPr>
+            <w:tcW w:w="1057" w:type="dxa"/>
             <w:tcBorders>
               <w:top w:val="single" w:sz="4" w:space="0" w:color="B7C2D6"/>
               <w:left w:val="single" w:sz="4" w:space="0" w:color="B7C2D6"/>
@@ -2244,7 +2318,7 @@
       <w:tr>
         <w:tc>
           <w:tcPr>
-            <w:tcW w:w="2000" w:type="dxa"/>
+            <w:tcW w:w="2114" w:type="dxa"/>
             <w:tcBorders>
               <w:top w:val="single" w:sz="4" w:space="0" w:color="B7C2D6"/>
               <w:left w:val="single" w:sz="4" w:space="0" w:color="B7C2D6"/>
@@ -2271,14 +2345,14 @@
             </w:r>
             <w:proofErr w:type="spellStart"/>
             <w:r>
-              <w:t>Niños</w:t>
-            </w:r>
-            <w:proofErr w:type="spellEnd"/>
-          </w:p>
-        </w:tc>
-        <w:tc>
-          <w:tcPr>
-            <w:tcW w:w="3080" w:type="dxa"/>
+              <w:t>Mascotas</w:t>
+            </w:r>
+            <w:proofErr w:type="spellEnd"/>
+          </w:p>
+        </w:tc>
+        <w:tc>
+          <w:tcPr>
+            <w:tcW w:w="3255" w:type="dxa"/>
             <w:tcBorders>
               <w:top w:val="single" w:sz="4" w:space="0" w:color="B7C2D6"/>
               <w:left w:val="single" w:sz="4" w:space="0" w:color="B7C2D6"/>
@@ -2347,7 +2421,15 @@
             </w:r>
             <w:proofErr w:type="spellStart"/>
             <w:r>
-              <w:t>niños</w:t>
+              <w:t>otras</w:t>
+            </w:r>
+            <w:proofErr w:type="spellEnd"/>
+            <w:r>
+              <w:t xml:space="preserve"> </w:t>
+            </w:r>
+            <w:proofErr w:type="spellStart"/>
+            <w:r>
+              <w:t>mascotas</w:t>
             </w:r>
             <w:proofErr w:type="spellEnd"/>
             <w:r>
@@ -2362,7 +2444,7 @@
         </w:tc>
         <w:tc>
           <w:tcPr>
-            <w:tcW w:w="1800" w:type="dxa"/>
+            <w:tcW w:w="1439" w:type="dxa"/>
             <w:tcBorders>
               <w:top w:val="single" w:sz="4" w:space="0" w:color="B7C2D6"/>
               <w:left w:val="single" w:sz="4" w:space="0" w:color="B7C2D6"/>
@@ -2385,7 +2467,7 @@
         </w:tc>
         <w:tc>
           <w:tcPr>
-            <w:tcW w:w="2200" w:type="dxa"/>
+            <w:tcW w:w="2325" w:type="dxa"/>
             <w:tcBorders>
               <w:top w:val="single" w:sz="4" w:space="0" w:color="B7C2D6"/>
               <w:left w:val="single" w:sz="4" w:space="0" w:color="B7C2D6"/>
@@ -2453,7 +2535,7 @@
         </w:tc>
         <w:tc>
           <w:tcPr>
-            <w:tcW w:w="1000" w:type="dxa"/>
+            <w:tcW w:w="1057" w:type="dxa"/>
             <w:tcBorders>
               <w:top w:val="single" w:sz="4" w:space="0" w:color="B7C2D6"/>
               <w:left w:val="single" w:sz="4" w:space="0" w:color="B7C2D6"/>
@@ -2478,7 +2560,7 @@
       <w:tr>
         <w:tc>
           <w:tcPr>
-            <w:tcW w:w="2000" w:type="dxa"/>
+            <w:tcW w:w="2114" w:type="dxa"/>
             <w:tcBorders>
               <w:top w:val="single" w:sz="4" w:space="0" w:color="B7C2D6"/>
               <w:left w:val="single" w:sz="4" w:space="0" w:color="B7C2D6"/>
@@ -2504,14 +2586,22 @@
             </w:r>
             <w:proofErr w:type="spellStart"/>
             <w:r>
-              <w:t>Mascotas</w:t>
-            </w:r>
-            <w:proofErr w:type="spellEnd"/>
-          </w:p>
-        </w:tc>
-        <w:tc>
-          <w:tcPr>
-            <w:tcW w:w="3080" w:type="dxa"/>
+              <w:t>espacios</w:t>
+            </w:r>
+            <w:proofErr w:type="spellEnd"/>
+            <w:r>
+              <w:t xml:space="preserve"> </w:t>
+            </w:r>
+            <w:proofErr w:type="spellStart"/>
+            <w:r>
+              <w:t>reducidos</w:t>
+            </w:r>
+            <w:proofErr w:type="spellEnd"/>
+          </w:p>
+        </w:tc>
+        <w:tc>
+          <w:tcPr>
+            <w:tcW w:w="3255" w:type="dxa"/>
             <w:tcBorders>
               <w:top w:val="single" w:sz="4" w:space="0" w:color="B7C2D6"/>
               <w:left w:val="single" w:sz="4" w:space="0" w:color="B7C2D6"/>
@@ -2572,7 +2662,7 @@
             </w:r>
             <w:proofErr w:type="spellStart"/>
             <w:r>
-              <w:t>contenga</w:t>
+              <w:t>tiene</w:t>
             </w:r>
             <w:proofErr w:type="spellEnd"/>
             <w:r>
@@ -2580,7 +2670,93 @@
             </w:r>
             <w:proofErr w:type="spellStart"/>
             <w:r>
-              <w:t>otras</w:t>
+              <w:t>poca</w:t>
+            </w:r>
+            <w:proofErr w:type="spellEnd"/>
+            <w:r>
+              <w:t xml:space="preserve"> area total</w:t>
+            </w:r>
+          </w:p>
+        </w:tc>
+        <w:tc>
+          <w:tcPr>
+            <w:tcW w:w="1439" w:type="dxa"/>
+            <w:tcBorders>
+              <w:top w:val="single" w:sz="4" w:space="0" w:color="B7C2D6"/>
+              <w:left w:val="single" w:sz="4" w:space="0" w:color="B7C2D6"/>
+              <w:bottom w:val="single" w:sz="4" w:space="0" w:color="B7C2D6"/>
+              <w:right w:val="single" w:sz="4" w:space="0" w:color="B7C2D6"/>
+            </w:tcBorders>
+            <w:tcMar>
+              <w:top w:w="80" w:type="dxa"/>
+              <w:left w:w="130" w:type="dxa"/>
+              <w:bottom w:w="80" w:type="dxa"/>
+              <w:right w:w="130" w:type="dxa"/>
+            </w:tcMar>
+            <w:vAlign w:val="center"/>
+          </w:tcPr>
+          <w:p>
+            <w:r>
+              <w:t>bool</w:t>
+            </w:r>
+          </w:p>
+        </w:tc>
+        <w:tc>
+          <w:tcPr>
+            <w:tcW w:w="2325" w:type="dxa"/>
+            <w:tcBorders>
+              <w:top w:val="single" w:sz="4" w:space="0" w:color="B7C2D6"/>
+              <w:left w:val="single" w:sz="4" w:space="0" w:color="B7C2D6"/>
+              <w:bottom w:val="single" w:sz="4" w:space="0" w:color="B7C2D6"/>
+              <w:right w:val="single" w:sz="4" w:space="0" w:color="B7C2D6"/>
+            </w:tcBorders>
+            <w:tcMar>
+              <w:top w:w="80" w:type="dxa"/>
+              <w:left w:w="130" w:type="dxa"/>
+              <w:bottom w:w="80" w:type="dxa"/>
+              <w:right w:w="130" w:type="dxa"/>
+            </w:tcMar>
+            <w:vAlign w:val="center"/>
+          </w:tcPr>
+          <w:p>
+            <w:r>
+              <w:t xml:space="preserve">Debe </w:t>
+            </w:r>
+            <w:proofErr w:type="spellStart"/>
+            <w:r>
+              <w:t>corresponder</w:t>
+            </w:r>
+            <w:proofErr w:type="spellEnd"/>
+            <w:r>
+              <w:t xml:space="preserve"> al </w:t>
+            </w:r>
+            <w:proofErr w:type="spellStart"/>
+            <w:r>
+              <w:t>resultado</w:t>
+            </w:r>
+            <w:proofErr w:type="spellEnd"/>
+            <w:r>
+              <w:t xml:space="preserve"> dado, al </w:t>
+            </w:r>
+            <w:proofErr w:type="spellStart"/>
+            <w:r>
+              <w:t>someter</w:t>
+            </w:r>
+            <w:proofErr w:type="spellEnd"/>
+            <w:r>
+              <w:t xml:space="preserve"> al animal a un </w:t>
+            </w:r>
+            <w:proofErr w:type="spellStart"/>
+            <w:r>
+              <w:t>ambiente</w:t>
+            </w:r>
+            <w:proofErr w:type="spellEnd"/>
+            <w:r>
+              <w:t xml:space="preserve"> con las </w:t>
+            </w:r>
+            <w:proofErr w:type="spellStart"/>
+            <w:r>
+              <w:t>carateristicas</w:t>
             </w:r>
             <w:proofErr w:type="spellEnd"/>
             <w:r>
@@ -2588,105 +2764,6 @@
             </w:r>
             <w:proofErr w:type="spellStart"/>
             <w:r>
-              <w:t>mascotas</w:t>
-            </w:r>
-            <w:proofErr w:type="spellEnd"/>
-            <w:r>
-              <w:t xml:space="preserve"> al </w:t>
-            </w:r>
-            <w:proofErr w:type="spellStart"/>
-            <w:r>
-              <w:t>rededor</w:t>
-            </w:r>
-            <w:proofErr w:type="spellEnd"/>
-          </w:p>
-        </w:tc>
-        <w:tc>
-          <w:tcPr>
-            <w:tcW w:w="1800" w:type="dxa"/>
-            <w:tcBorders>
-              <w:top w:val="single" w:sz="4" w:space="0" w:color="B7C2D6"/>
-              <w:left w:val="single" w:sz="4" w:space="0" w:color="B7C2D6"/>
-              <w:bottom w:val="single" w:sz="4" w:space="0" w:color="B7C2D6"/>
-              <w:right w:val="single" w:sz="4" w:space="0" w:color="B7C2D6"/>
-            </w:tcBorders>
-            <w:tcMar>
-              <w:top w:w="80" w:type="dxa"/>
-              <w:left w:w="130" w:type="dxa"/>
-              <w:bottom w:w="80" w:type="dxa"/>
-              <w:right w:w="130" w:type="dxa"/>
-            </w:tcMar>
-            <w:vAlign w:val="center"/>
-          </w:tcPr>
-          <w:p>
-            <w:r>
-              <w:t>bool</w:t>
-            </w:r>
-          </w:p>
-        </w:tc>
-        <w:tc>
-          <w:tcPr>
-            <w:tcW w:w="2200" w:type="dxa"/>
-            <w:tcBorders>
-              <w:top w:val="single" w:sz="4" w:space="0" w:color="B7C2D6"/>
-              <w:left w:val="single" w:sz="4" w:space="0" w:color="B7C2D6"/>
-              <w:bottom w:val="single" w:sz="4" w:space="0" w:color="B7C2D6"/>
-              <w:right w:val="single" w:sz="4" w:space="0" w:color="B7C2D6"/>
-            </w:tcBorders>
-            <w:tcMar>
-              <w:top w:w="80" w:type="dxa"/>
-              <w:left w:w="130" w:type="dxa"/>
-              <w:bottom w:w="80" w:type="dxa"/>
-              <w:right w:w="130" w:type="dxa"/>
-            </w:tcMar>
-            <w:vAlign w:val="center"/>
-          </w:tcPr>
-          <w:p>
-            <w:r>
-              <w:t xml:space="preserve">Debe </w:t>
-            </w:r>
-            <w:proofErr w:type="spellStart"/>
-            <w:r>
-              <w:t>corresponder</w:t>
-            </w:r>
-            <w:proofErr w:type="spellEnd"/>
-            <w:r>
-              <w:t xml:space="preserve"> al </w:t>
-            </w:r>
-            <w:proofErr w:type="spellStart"/>
-            <w:r>
-              <w:t>resultado</w:t>
-            </w:r>
-            <w:proofErr w:type="spellEnd"/>
-            <w:r>
-              <w:t xml:space="preserve"> dado, al </w:t>
-            </w:r>
-            <w:proofErr w:type="spellStart"/>
-            <w:r>
-              <w:t>someter</w:t>
-            </w:r>
-            <w:proofErr w:type="spellEnd"/>
-            <w:r>
-              <w:t xml:space="preserve"> al animal a un </w:t>
-            </w:r>
-            <w:proofErr w:type="spellStart"/>
-            <w:r>
-              <w:t>ambiente</w:t>
-            </w:r>
-            <w:proofErr w:type="spellEnd"/>
-            <w:r>
-              <w:t xml:space="preserve"> con las </w:t>
-            </w:r>
-            <w:proofErr w:type="spellStart"/>
-            <w:r>
-              <w:t>carateristicas</w:t>
-            </w:r>
-            <w:proofErr w:type="spellEnd"/>
-            <w:r>
-              <w:t xml:space="preserve"> </w:t>
-            </w:r>
-            <w:proofErr w:type="spellStart"/>
-            <w:r>
               <w:t>mencionadas</w:t>
             </w:r>
             <w:proofErr w:type="spellEnd"/>
@@ -2694,243 +2771,7 @@
         </w:tc>
         <w:tc>
           <w:tcPr>
-            <w:tcW w:w="1000" w:type="dxa"/>
-            <w:tcBorders>
-              <w:top w:val="single" w:sz="4" w:space="0" w:color="B7C2D6"/>
-              <w:left w:val="single" w:sz="4" w:space="0" w:color="B7C2D6"/>
-              <w:bottom w:val="single" w:sz="4" w:space="0" w:color="B7C2D6"/>
-              <w:right w:val="single" w:sz="4" w:space="0" w:color="B7C2D6"/>
-            </w:tcBorders>
-            <w:tcMar>
-              <w:top w:w="80" w:type="dxa"/>
-              <w:left w:w="130" w:type="dxa"/>
-              <w:bottom w:w="80" w:type="dxa"/>
-              <w:right w:w="130" w:type="dxa"/>
-            </w:tcMar>
-            <w:vAlign w:val="center"/>
-          </w:tcPr>
-          <w:p>
-            <w:r>
-              <w:t>Si</w:t>
-            </w:r>
-          </w:p>
-        </w:tc>
-      </w:tr>
-      <w:tr>
-        <w:tc>
-          <w:tcPr>
-            <w:tcW w:w="2000" w:type="dxa"/>
-            <w:tcBorders>
-              <w:top w:val="single" w:sz="4" w:space="0" w:color="B7C2D6"/>
-              <w:left w:val="single" w:sz="4" w:space="0" w:color="B7C2D6"/>
-              <w:bottom w:val="single" w:sz="4" w:space="0" w:color="B7C2D6"/>
-              <w:right w:val="single" w:sz="4" w:space="0" w:color="B7C2D6"/>
-            </w:tcBorders>
-            <w:tcMar>
-              <w:top w:w="80" w:type="dxa"/>
-              <w:left w:w="130" w:type="dxa"/>
-              <w:bottom w:w="80" w:type="dxa"/>
-              <w:right w:w="130" w:type="dxa"/>
-            </w:tcMar>
-            <w:vAlign w:val="center"/>
-          </w:tcPr>
-          <w:p>
-            <w:proofErr w:type="spellStart"/>
-            <w:r>
-              <w:t>Compatibilidad</w:t>
-            </w:r>
-            <w:proofErr w:type="spellEnd"/>
-            <w:r>
-              <w:t xml:space="preserve"> </w:t>
-            </w:r>
-            <w:proofErr w:type="spellStart"/>
-            <w:r>
-              <w:t>espacios</w:t>
-            </w:r>
-            <w:proofErr w:type="spellEnd"/>
-            <w:r>
-              <w:t xml:space="preserve"> </w:t>
-            </w:r>
-            <w:proofErr w:type="spellStart"/>
-            <w:r>
-              <w:t>reducidos</w:t>
-            </w:r>
-            <w:proofErr w:type="spellEnd"/>
-          </w:p>
-        </w:tc>
-        <w:tc>
-          <w:tcPr>
-            <w:tcW w:w="3080" w:type="dxa"/>
-            <w:tcBorders>
-              <w:top w:val="single" w:sz="4" w:space="0" w:color="B7C2D6"/>
-              <w:left w:val="single" w:sz="4" w:space="0" w:color="B7C2D6"/>
-              <w:bottom w:val="single" w:sz="4" w:space="0" w:color="B7C2D6"/>
-              <w:right w:val="single" w:sz="4" w:space="0" w:color="B7C2D6"/>
-            </w:tcBorders>
-            <w:tcMar>
-              <w:top w:w="80" w:type="dxa"/>
-              <w:left w:w="130" w:type="dxa"/>
-              <w:bottom w:w="80" w:type="dxa"/>
-              <w:right w:w="130" w:type="dxa"/>
-            </w:tcMar>
-            <w:vAlign w:val="center"/>
-          </w:tcPr>
-          <w:p>
-            <w:r>
-              <w:t xml:space="preserve">Describe </w:t>
-            </w:r>
-            <w:proofErr w:type="spellStart"/>
-            <w:r>
-              <w:t>si</w:t>
-            </w:r>
-            <w:proofErr w:type="spellEnd"/>
-            <w:r>
-              <w:t xml:space="preserve"> </w:t>
-            </w:r>
-            <w:proofErr w:type="spellStart"/>
-            <w:r>
-              <w:t>esta</w:t>
-            </w:r>
-            <w:proofErr w:type="spellEnd"/>
-            <w:r>
-              <w:t xml:space="preserve"> </w:t>
-            </w:r>
-            <w:proofErr w:type="spellStart"/>
-            <w:r>
-              <w:t>mascota</w:t>
-            </w:r>
-            <w:proofErr w:type="spellEnd"/>
-            <w:r>
-              <w:t xml:space="preserve"> es </w:t>
-            </w:r>
-            <w:proofErr w:type="spellStart"/>
-            <w:r>
-              <w:t>apta</w:t>
-            </w:r>
-            <w:proofErr w:type="spellEnd"/>
-            <w:r>
-              <w:t xml:space="preserve"> para un </w:t>
-            </w:r>
-            <w:proofErr w:type="spellStart"/>
-            <w:r>
-              <w:t>ambiente</w:t>
-            </w:r>
-            <w:proofErr w:type="spellEnd"/>
-            <w:r>
-              <w:t xml:space="preserve"> que </w:t>
-            </w:r>
-            <w:proofErr w:type="spellStart"/>
-            <w:r>
-              <w:t>tiene</w:t>
-            </w:r>
-            <w:proofErr w:type="spellEnd"/>
-            <w:r>
-              <w:t xml:space="preserve"> </w:t>
-            </w:r>
-            <w:proofErr w:type="spellStart"/>
-            <w:r>
-              <w:t>poca</w:t>
-            </w:r>
-            <w:proofErr w:type="spellEnd"/>
-            <w:r>
-              <w:t xml:space="preserve"> area total</w:t>
-            </w:r>
-          </w:p>
-        </w:tc>
-        <w:tc>
-          <w:tcPr>
-            <w:tcW w:w="1800" w:type="dxa"/>
-            <w:tcBorders>
-              <w:top w:val="single" w:sz="4" w:space="0" w:color="B7C2D6"/>
-              <w:left w:val="single" w:sz="4" w:space="0" w:color="B7C2D6"/>
-              <w:bottom w:val="single" w:sz="4" w:space="0" w:color="B7C2D6"/>
-              <w:right w:val="single" w:sz="4" w:space="0" w:color="B7C2D6"/>
-            </w:tcBorders>
-            <w:tcMar>
-              <w:top w:w="80" w:type="dxa"/>
-              <w:left w:w="130" w:type="dxa"/>
-              <w:bottom w:w="80" w:type="dxa"/>
-              <w:right w:w="130" w:type="dxa"/>
-            </w:tcMar>
-            <w:vAlign w:val="center"/>
-          </w:tcPr>
-          <w:p>
-            <w:r>
-              <w:t>bool</w:t>
-            </w:r>
-          </w:p>
-        </w:tc>
-        <w:tc>
-          <w:tcPr>
-            <w:tcW w:w="2200" w:type="dxa"/>
-            <w:tcBorders>
-              <w:top w:val="single" w:sz="4" w:space="0" w:color="B7C2D6"/>
-              <w:left w:val="single" w:sz="4" w:space="0" w:color="B7C2D6"/>
-              <w:bottom w:val="single" w:sz="4" w:space="0" w:color="B7C2D6"/>
-              <w:right w:val="single" w:sz="4" w:space="0" w:color="B7C2D6"/>
-            </w:tcBorders>
-            <w:tcMar>
-              <w:top w:w="80" w:type="dxa"/>
-              <w:left w:w="130" w:type="dxa"/>
-              <w:bottom w:w="80" w:type="dxa"/>
-              <w:right w:w="130" w:type="dxa"/>
-            </w:tcMar>
-            <w:vAlign w:val="center"/>
-          </w:tcPr>
-          <w:p>
-            <w:r>
-              <w:t xml:space="preserve">Debe </w:t>
-            </w:r>
-            <w:proofErr w:type="spellStart"/>
-            <w:r>
-              <w:t>corresponder</w:t>
-            </w:r>
-            <w:proofErr w:type="spellEnd"/>
-            <w:r>
-              <w:t xml:space="preserve"> al </w:t>
-            </w:r>
-            <w:proofErr w:type="spellStart"/>
-            <w:r>
-              <w:t>resultado</w:t>
-            </w:r>
-            <w:proofErr w:type="spellEnd"/>
-            <w:r>
-              <w:t xml:space="preserve"> dado, al </w:t>
-            </w:r>
-            <w:proofErr w:type="spellStart"/>
-            <w:r>
-              <w:t>someter</w:t>
-            </w:r>
-            <w:proofErr w:type="spellEnd"/>
-            <w:r>
-              <w:t xml:space="preserve"> al animal a un </w:t>
-            </w:r>
-            <w:proofErr w:type="spellStart"/>
-            <w:r>
-              <w:t>ambiente</w:t>
-            </w:r>
-            <w:proofErr w:type="spellEnd"/>
-            <w:r>
-              <w:t xml:space="preserve"> con las </w:t>
-            </w:r>
-            <w:proofErr w:type="spellStart"/>
-            <w:r>
-              <w:t>carateristicas</w:t>
-            </w:r>
-            <w:proofErr w:type="spellEnd"/>
-            <w:r>
-              <w:t xml:space="preserve"> </w:t>
-            </w:r>
-            <w:proofErr w:type="spellStart"/>
-            <w:r>
-              <w:t>mencionadas</w:t>
-            </w:r>
-            <w:proofErr w:type="spellEnd"/>
-          </w:p>
-        </w:tc>
-        <w:tc>
-          <w:tcPr>
-            <w:tcW w:w="1000" w:type="dxa"/>
+            <w:tcW w:w="1057" w:type="dxa"/>
             <w:tcBorders>
               <w:top w:val="single" w:sz="4" w:space="0" w:color="B7C2D6"/>
               <w:left w:val="single" w:sz="4" w:space="0" w:color="B7C2D6"/>
@@ -3399,6 +3240,162 @@
           </w:p>
         </w:tc>
       </w:tr>
+      <w:tr>
+        <w:tc>
+          <w:tcPr>
+            <w:tcW w:w="2000" w:type="dxa"/>
+            <w:tcBorders>
+              <w:top w:val="single" w:sz="4" w:space="0" w:color="B7C2D6"/>
+              <w:left w:val="single" w:sz="4" w:space="0" w:color="B7C2D6"/>
+              <w:bottom w:val="single" w:sz="4" w:space="0" w:color="B7C2D6"/>
+              <w:right w:val="single" w:sz="4" w:space="0" w:color="B7C2D6"/>
+            </w:tcBorders>
+            <w:tcMar>
+              <w:top w:w="80" w:type="dxa"/>
+              <w:left w:w="130" w:type="dxa"/>
+              <w:bottom w:w="80" w:type="dxa"/>
+              <w:right w:w="130" w:type="dxa"/>
+            </w:tcMar>
+            <w:vAlign w:val="center"/>
+          </w:tcPr>
+          <w:p>
+            <w:r>
+              <w:t>ID</w:t>
+            </w:r>
+          </w:p>
+        </w:tc>
+        <w:tc>
+          <w:tcPr>
+            <w:tcW w:w="3080" w:type="dxa"/>
+            <w:tcBorders>
+              <w:top w:val="single" w:sz="4" w:space="0" w:color="B7C2D6"/>
+              <w:left w:val="single" w:sz="4" w:space="0" w:color="B7C2D6"/>
+              <w:bottom w:val="single" w:sz="4" w:space="0" w:color="B7C2D6"/>
+              <w:right w:val="single" w:sz="4" w:space="0" w:color="B7C2D6"/>
+            </w:tcBorders>
+            <w:tcMar>
+              <w:top w:w="80" w:type="dxa"/>
+              <w:left w:w="130" w:type="dxa"/>
+              <w:bottom w:w="80" w:type="dxa"/>
+              <w:right w:w="130" w:type="dxa"/>
+            </w:tcMar>
+            <w:vAlign w:val="center"/>
+          </w:tcPr>
+          <w:p>
+            <w:proofErr w:type="spellStart"/>
+            <w:r>
+              <w:t>Identificador</w:t>
+            </w:r>
+            <w:proofErr w:type="spellEnd"/>
+            <w:r>
+              <w:t xml:space="preserve"> </w:t>
+            </w:r>
+            <w:proofErr w:type="spellStart"/>
+            <w:r>
+              <w:t>unico</w:t>
+            </w:r>
+            <w:proofErr w:type="spellEnd"/>
+            <w:r>
+              <w:t xml:space="preserve"> para la </w:t>
+            </w:r>
+            <w:proofErr w:type="spellStart"/>
+            <w:r>
+              <w:t>mascota</w:t>
+            </w:r>
+            <w:proofErr w:type="spellEnd"/>
+          </w:p>
+        </w:tc>
+        <w:tc>
+          <w:tcPr>
+            <w:tcW w:w="1800" w:type="dxa"/>
+            <w:tcBorders>
+              <w:top w:val="single" w:sz="4" w:space="0" w:color="B7C2D6"/>
+              <w:left w:val="single" w:sz="4" w:space="0" w:color="B7C2D6"/>
+              <w:bottom w:val="single" w:sz="4" w:space="0" w:color="B7C2D6"/>
+              <w:right w:val="single" w:sz="4" w:space="0" w:color="B7C2D6"/>
+            </w:tcBorders>
+            <w:tcMar>
+              <w:top w:w="80" w:type="dxa"/>
+              <w:left w:w="130" w:type="dxa"/>
+              <w:bottom w:w="80" w:type="dxa"/>
+              <w:right w:w="130" w:type="dxa"/>
+            </w:tcMar>
+            <w:vAlign w:val="center"/>
+          </w:tcPr>
+          <w:p>
+            <w:r>
+              <w:t>UUID</w:t>
+            </w:r>
+          </w:p>
+        </w:tc>
+        <w:tc>
+          <w:tcPr>
+            <w:tcW w:w="2200" w:type="dxa"/>
+            <w:tcBorders>
+              <w:top w:val="single" w:sz="4" w:space="0" w:color="B7C2D6"/>
+              <w:left w:val="single" w:sz="4" w:space="0" w:color="B7C2D6"/>
+              <w:bottom w:val="single" w:sz="4" w:space="0" w:color="B7C2D6"/>
+              <w:right w:val="single" w:sz="4" w:space="0" w:color="B7C2D6"/>
+            </w:tcBorders>
+            <w:tcMar>
+              <w:top w:w="80" w:type="dxa"/>
+              <w:left w:w="130" w:type="dxa"/>
+              <w:bottom w:w="80" w:type="dxa"/>
+              <w:right w:w="130" w:type="dxa"/>
+            </w:tcMar>
+            <w:vAlign w:val="center"/>
+          </w:tcPr>
+          <w:p>
+            <w:proofErr w:type="spellStart"/>
+            <w:r>
+              <w:t>Formato</w:t>
+            </w:r>
+            <w:proofErr w:type="spellEnd"/>
+            <w:r>
+              <w:t xml:space="preserve"> </w:t>
+            </w:r>
+            <w:proofErr w:type="spellStart"/>
+            <w:r>
+              <w:t>unico</w:t>
+            </w:r>
+            <w:proofErr w:type="spellEnd"/>
+            <w:r>
+              <w:t xml:space="preserve"> auto-</w:t>
+            </w:r>
+            <w:proofErr w:type="spellStart"/>
+            <w:r>
+              <w:t>Generado</w:t>
+            </w:r>
+            <w:proofErr w:type="spellEnd"/>
+            <w:r>
+              <w:t xml:space="preserve"> ESPECIE-XXX</w:t>
+            </w:r>
+          </w:p>
+        </w:tc>
+        <w:tc>
+          <w:tcPr>
+            <w:tcW w:w="1000" w:type="dxa"/>
+            <w:tcBorders>
+              <w:top w:val="single" w:sz="4" w:space="0" w:color="B7C2D6"/>
+              <w:left w:val="single" w:sz="4" w:space="0" w:color="B7C2D6"/>
+              <w:bottom w:val="single" w:sz="4" w:space="0" w:color="B7C2D6"/>
+              <w:right w:val="single" w:sz="4" w:space="0" w:color="B7C2D6"/>
+            </w:tcBorders>
+            <w:tcMar>
+              <w:top w:w="80" w:type="dxa"/>
+              <w:left w:w="130" w:type="dxa"/>
+              <w:bottom w:w="80" w:type="dxa"/>
+              <w:right w:w="130" w:type="dxa"/>
+            </w:tcMar>
+            <w:vAlign w:val="center"/>
+          </w:tcPr>
+          <w:p>
+            <w:r>
+              <w:t>Si</w:t>
+            </w:r>
+          </w:p>
+        </w:tc>
+      </w:tr>
     </w:tbl>
     <w:p>
       <w:pPr>
@@ -3686,73 +3683,73 @@
             </w:r>
             <w:proofErr w:type="spellEnd"/>
             <w:r>
+              <w:t xml:space="preserve"> web </w:t>
+            </w:r>
+            <w:proofErr w:type="spellStart"/>
+            <w:r>
+              <w:t>donde</w:t>
+            </w:r>
+            <w:proofErr w:type="spellEnd"/>
+            <w:r>
+              <w:t xml:space="preserve"> se </w:t>
+            </w:r>
+            <w:proofErr w:type="spellStart"/>
+            <w:r>
+              <w:t>pueda</w:t>
+            </w:r>
+            <w:proofErr w:type="spellEnd"/>
+            <w:r>
               <w:t xml:space="preserve"> </w:t>
             </w:r>
-            <w:r>
-              <w:t xml:space="preserve">web </w:t>
-            </w:r>
-            <w:proofErr w:type="spellStart"/>
-            <w:r>
-              <w:t>donde</w:t>
-            </w:r>
-            <w:proofErr w:type="spellEnd"/>
-            <w:r>
-              <w:t xml:space="preserve"> se </w:t>
-            </w:r>
-            <w:proofErr w:type="spellStart"/>
-            <w:r>
-              <w:t>pueda</w:t>
+            <w:proofErr w:type="spellStart"/>
+            <w:r>
+              <w:t>verificar</w:t>
+            </w:r>
+            <w:proofErr w:type="spellEnd"/>
+            <w:r>
+              <w:t xml:space="preserve"> las </w:t>
+            </w:r>
+            <w:proofErr w:type="spellStart"/>
+            <w:r>
+              <w:t>credenciales</w:t>
+            </w:r>
+            <w:proofErr w:type="spellEnd"/>
+            <w:r>
+              <w:t xml:space="preserve"> del </w:t>
+            </w:r>
+            <w:proofErr w:type="spellStart"/>
+            <w:r>
+              <w:t>administrador</w:t>
             </w:r>
             <w:proofErr w:type="spellEnd"/>
             <w:r>
               <w:t xml:space="preserve"> </w:t>
             </w:r>
-            <w:proofErr w:type="spellStart"/>
-            <w:r>
-              <w:t>verificar</w:t>
-            </w:r>
-            <w:proofErr w:type="spellEnd"/>
-            <w:r>
-              <w:t xml:space="preserve"> las </w:t>
-            </w:r>
-            <w:proofErr w:type="spellStart"/>
-            <w:r>
-              <w:t>credenciales</w:t>
-            </w:r>
-            <w:proofErr w:type="spellEnd"/>
-            <w:r>
-              <w:t xml:space="preserve"> del </w:t>
-            </w:r>
-            <w:proofErr w:type="spellStart"/>
-            <w:r>
-              <w:t>administrador</w:t>
-            </w:r>
-            <w:proofErr w:type="spellEnd"/>
+          </w:p>
+        </w:tc>
+        <w:tc>
+          <w:tcPr>
+            <w:tcW w:w="2400" w:type="dxa"/>
+            <w:tcBorders>
+              <w:top w:val="single" w:sz="4" w:space="0" w:color="B7C2D6"/>
+              <w:left w:val="single" w:sz="4" w:space="0" w:color="B7C2D6"/>
+              <w:bottom w:val="single" w:sz="4" w:space="0" w:color="B7C2D6"/>
+              <w:right w:val="single" w:sz="4" w:space="0" w:color="B7C2D6"/>
+            </w:tcBorders>
+            <w:tcMar>
+              <w:top w:w="80" w:type="dxa"/>
+              <w:left w:w="130" w:type="dxa"/>
+              <w:bottom w:w="80" w:type="dxa"/>
+              <w:right w:w="130" w:type="dxa"/>
+            </w:tcMar>
+            <w:vAlign w:val="center"/>
+          </w:tcPr>
+          <w:p>
+            <w:r>
+              <w:t>FA1</w:t>
+            </w:r>
             <w:r>
               <w:t xml:space="preserve"> </w:t>
-            </w:r>
-          </w:p>
-        </w:tc>
-        <w:tc>
-          <w:tcPr>
-            <w:tcW w:w="2400" w:type="dxa"/>
-            <w:tcBorders>
-              <w:top w:val="single" w:sz="4" w:space="0" w:color="B7C2D6"/>
-              <w:left w:val="single" w:sz="4" w:space="0" w:color="B7C2D6"/>
-              <w:bottom w:val="single" w:sz="4" w:space="0" w:color="B7C2D6"/>
-              <w:right w:val="single" w:sz="4" w:space="0" w:color="B7C2D6"/>
-            </w:tcBorders>
-            <w:tcMar>
-              <w:top w:w="80" w:type="dxa"/>
-              <w:left w:w="130" w:type="dxa"/>
-              <w:bottom w:w="80" w:type="dxa"/>
-              <w:right w:w="130" w:type="dxa"/>
-            </w:tcMar>
-            <w:vAlign w:val="center"/>
-          </w:tcPr>
-          <w:p>
-            <w:r>
-              <w:t>FA1</w:t>
             </w:r>
           </w:p>
         </w:tc>
@@ -3830,8 +3827,378 @@
             <w:r>
               <w:t xml:space="preserve"> </w:t>
             </w:r>
-            <w:bookmarkStart w:id="0" w:name="_GoBack"/>
-            <w:bookmarkEnd w:id="0"/>
+            <w:r>
+              <w:t xml:space="preserve">una </w:t>
+            </w:r>
+            <w:proofErr w:type="spellStart"/>
+            <w:r>
+              <w:t>seccion</w:t>
+            </w:r>
+            <w:proofErr w:type="spellEnd"/>
+            <w:r>
+              <w:t xml:space="preserve"> </w:t>
+            </w:r>
+            <w:proofErr w:type="spellStart"/>
+            <w:r>
+              <w:t>donde</w:t>
+            </w:r>
+            <w:proofErr w:type="spellEnd"/>
+            <w:r>
+              <w:t xml:space="preserve"> se </w:t>
+            </w:r>
+            <w:proofErr w:type="spellStart"/>
+            <w:r>
+              <w:t>puedan</w:t>
+            </w:r>
+            <w:proofErr w:type="spellEnd"/>
+            <w:r>
+              <w:t xml:space="preserve"> </w:t>
+            </w:r>
+            <w:proofErr w:type="spellStart"/>
+            <w:r>
+              <w:t>ingresar</w:t>
+            </w:r>
+            <w:proofErr w:type="spellEnd"/>
+            <w:r>
+              <w:t xml:space="preserve"> </w:t>
+            </w:r>
+            <w:proofErr w:type="spellStart"/>
+            <w:r>
+              <w:t>todas</w:t>
+            </w:r>
+            <w:proofErr w:type="spellEnd"/>
+            <w:r>
+              <w:t xml:space="preserve"> las </w:t>
+            </w:r>
+            <w:proofErr w:type="spellStart"/>
+            <w:r>
+              <w:t>caracteristicas</w:t>
+            </w:r>
+            <w:proofErr w:type="spellEnd"/>
+            <w:r>
+              <w:t xml:space="preserve"> de la </w:t>
+            </w:r>
+            <w:proofErr w:type="spellStart"/>
+            <w:r>
+              <w:t>mascota</w:t>
+            </w:r>
+            <w:proofErr w:type="spellEnd"/>
+            <w:r>
+              <w:t xml:space="preserve"> </w:t>
+            </w:r>
+            <w:proofErr w:type="gramStart"/>
+            <w:r>
+              <w:t>a</w:t>
+            </w:r>
+            <w:proofErr w:type="gramEnd"/>
+            <w:r>
+              <w:t xml:space="preserve"> </w:t>
+            </w:r>
+            <w:proofErr w:type="spellStart"/>
+            <w:r>
+              <w:t>ingresar</w:t>
+            </w:r>
+            <w:proofErr w:type="spellEnd"/>
+            <w:r>
+              <w:t xml:space="preserve"> </w:t>
+            </w:r>
+          </w:p>
+        </w:tc>
+        <w:tc>
+          <w:tcPr>
+            <w:tcW w:w="2400" w:type="dxa"/>
+            <w:tcBorders>
+              <w:top w:val="single" w:sz="4" w:space="0" w:color="B7C2D6"/>
+              <w:left w:val="single" w:sz="4" w:space="0" w:color="B7C2D6"/>
+              <w:bottom w:val="single" w:sz="4" w:space="0" w:color="B7C2D6"/>
+              <w:right w:val="single" w:sz="4" w:space="0" w:color="B7C2D6"/>
+            </w:tcBorders>
+            <w:tcMar>
+              <w:top w:w="80" w:type="dxa"/>
+              <w:left w:w="130" w:type="dxa"/>
+              <w:bottom w:w="80" w:type="dxa"/>
+              <w:right w:w="130" w:type="dxa"/>
+            </w:tcMar>
+            <w:vAlign w:val="center"/>
+          </w:tcPr>
+          <w:p/>
+        </w:tc>
+      </w:tr>
+      <w:tr>
+        <w:tc>
+          <w:tcPr>
+            <w:tcW w:w="1200" w:type="dxa"/>
+            <w:tcBorders>
+              <w:top w:val="single" w:sz="4" w:space="0" w:color="B7C2D6"/>
+              <w:left w:val="single" w:sz="4" w:space="0" w:color="B7C2D6"/>
+              <w:bottom w:val="single" w:sz="4" w:space="0" w:color="B7C2D6"/>
+              <w:right w:val="single" w:sz="4" w:space="0" w:color="B7C2D6"/>
+            </w:tcBorders>
+            <w:tcMar>
+              <w:top w:w="80" w:type="dxa"/>
+              <w:left w:w="130" w:type="dxa"/>
+              <w:bottom w:w="80" w:type="dxa"/>
+              <w:right w:w="130" w:type="dxa"/>
+            </w:tcMar>
+            <w:vAlign w:val="center"/>
+          </w:tcPr>
+          <w:p>
+            <w:r>
+              <w:t>3</w:t>
+            </w:r>
+          </w:p>
+        </w:tc>
+        <w:tc>
+          <w:tcPr>
+            <w:tcW w:w="2200" w:type="dxa"/>
+            <w:tcBorders>
+              <w:top w:val="single" w:sz="4" w:space="0" w:color="B7C2D6"/>
+              <w:left w:val="single" w:sz="4" w:space="0" w:color="B7C2D6"/>
+              <w:bottom w:val="single" w:sz="4" w:space="0" w:color="B7C2D6"/>
+              <w:right w:val="single" w:sz="4" w:space="0" w:color="B7C2D6"/>
+            </w:tcBorders>
+            <w:tcMar>
+              <w:top w:w="80" w:type="dxa"/>
+              <w:left w:w="130" w:type="dxa"/>
+              <w:bottom w:w="80" w:type="dxa"/>
+              <w:right w:w="130" w:type="dxa"/>
+            </w:tcMar>
+            <w:vAlign w:val="center"/>
+          </w:tcPr>
+          <w:p>
+            <w:proofErr w:type="spellStart"/>
+            <w:r>
+              <w:t>Administrador</w:t>
+            </w:r>
+            <w:proofErr w:type="spellEnd"/>
+          </w:p>
+        </w:tc>
+        <w:tc>
+          <w:tcPr>
+            <w:tcW w:w="4280" w:type="dxa"/>
+            <w:tcBorders>
+              <w:top w:val="single" w:sz="4" w:space="0" w:color="B7C2D6"/>
+              <w:left w:val="single" w:sz="4" w:space="0" w:color="B7C2D6"/>
+              <w:bottom w:val="single" w:sz="4" w:space="0" w:color="B7C2D6"/>
+              <w:right w:val="single" w:sz="4" w:space="0" w:color="B7C2D6"/>
+            </w:tcBorders>
+            <w:tcMar>
+              <w:top w:w="80" w:type="dxa"/>
+              <w:left w:w="130" w:type="dxa"/>
+              <w:bottom w:w="80" w:type="dxa"/>
+              <w:right w:w="130" w:type="dxa"/>
+            </w:tcMar>
+            <w:vAlign w:val="center"/>
+          </w:tcPr>
+          <w:p>
+            <w:proofErr w:type="spellStart"/>
+            <w:r>
+              <w:t>Ingresar</w:t>
+            </w:r>
+            <w:proofErr w:type="spellEnd"/>
+            <w:r>
+              <w:t xml:space="preserve"> las </w:t>
+            </w:r>
+            <w:proofErr w:type="spellStart"/>
+            <w:r>
+              <w:t>caracteristicas</w:t>
+            </w:r>
+            <w:proofErr w:type="spellEnd"/>
+            <w:r>
+              <w:t xml:space="preserve"> </w:t>
+            </w:r>
+            <w:proofErr w:type="spellStart"/>
+            <w:r>
+              <w:t>pedidas</w:t>
+            </w:r>
+            <w:proofErr w:type="spellEnd"/>
+            <w:r>
+              <w:t xml:space="preserve"> por el Sistema para </w:t>
+            </w:r>
+            <w:proofErr w:type="spellStart"/>
+            <w:r>
+              <w:t>poder</w:t>
+            </w:r>
+            <w:proofErr w:type="spellEnd"/>
+            <w:r>
+              <w:t xml:space="preserve"> </w:t>
+            </w:r>
+            <w:proofErr w:type="spellStart"/>
+            <w:r>
+              <w:t>tener</w:t>
+            </w:r>
+            <w:proofErr w:type="spellEnd"/>
+            <w:r>
+              <w:t xml:space="preserve"> la </w:t>
+            </w:r>
+            <w:proofErr w:type="spellStart"/>
+            <w:r>
+              <w:t>informacion</w:t>
+            </w:r>
+            <w:proofErr w:type="spellEnd"/>
+            <w:r>
+              <w:t xml:space="preserve"> de la </w:t>
+            </w:r>
+            <w:proofErr w:type="spellStart"/>
+            <w:r>
+              <w:t>mascota</w:t>
+            </w:r>
+            <w:proofErr w:type="spellEnd"/>
+          </w:p>
+        </w:tc>
+        <w:tc>
+          <w:tcPr>
+            <w:tcW w:w="2400" w:type="dxa"/>
+            <w:tcBorders>
+              <w:top w:val="single" w:sz="4" w:space="0" w:color="B7C2D6"/>
+              <w:left w:val="single" w:sz="4" w:space="0" w:color="B7C2D6"/>
+              <w:bottom w:val="single" w:sz="4" w:space="0" w:color="B7C2D6"/>
+              <w:right w:val="single" w:sz="4" w:space="0" w:color="B7C2D6"/>
+            </w:tcBorders>
+            <w:tcMar>
+              <w:top w:w="80" w:type="dxa"/>
+              <w:left w:w="130" w:type="dxa"/>
+              <w:bottom w:w="80" w:type="dxa"/>
+              <w:right w:w="130" w:type="dxa"/>
+            </w:tcMar>
+            <w:vAlign w:val="center"/>
+          </w:tcPr>
+          <w:p>
+            <w:r>
+              <w:t>FA</w:t>
+            </w:r>
+            <w:r>
+              <w:t>2</w:t>
+            </w:r>
+          </w:p>
+        </w:tc>
+      </w:tr>
+      <w:tr>
+        <w:tc>
+          <w:tcPr>
+            <w:tcW w:w="1200" w:type="dxa"/>
+            <w:tcBorders>
+              <w:top w:val="single" w:sz="4" w:space="0" w:color="B7C2D6"/>
+              <w:left w:val="single" w:sz="4" w:space="0" w:color="B7C2D6"/>
+              <w:bottom w:val="single" w:sz="4" w:space="0" w:color="B7C2D6"/>
+              <w:right w:val="single" w:sz="4" w:space="0" w:color="B7C2D6"/>
+            </w:tcBorders>
+            <w:tcMar>
+              <w:top w:w="80" w:type="dxa"/>
+              <w:left w:w="130" w:type="dxa"/>
+              <w:bottom w:w="80" w:type="dxa"/>
+              <w:right w:w="130" w:type="dxa"/>
+            </w:tcMar>
+            <w:vAlign w:val="center"/>
+          </w:tcPr>
+          <w:p>
+            <w:r>
+              <w:t>4</w:t>
+            </w:r>
+          </w:p>
+        </w:tc>
+        <w:tc>
+          <w:tcPr>
+            <w:tcW w:w="2200" w:type="dxa"/>
+            <w:tcBorders>
+              <w:top w:val="single" w:sz="4" w:space="0" w:color="B7C2D6"/>
+              <w:left w:val="single" w:sz="4" w:space="0" w:color="B7C2D6"/>
+              <w:bottom w:val="single" w:sz="4" w:space="0" w:color="B7C2D6"/>
+              <w:right w:val="single" w:sz="4" w:space="0" w:color="B7C2D6"/>
+            </w:tcBorders>
+            <w:tcMar>
+              <w:top w:w="80" w:type="dxa"/>
+              <w:left w:w="130" w:type="dxa"/>
+              <w:bottom w:w="80" w:type="dxa"/>
+              <w:right w:w="130" w:type="dxa"/>
+            </w:tcMar>
+            <w:vAlign w:val="center"/>
+          </w:tcPr>
+          <w:p>
+            <w:r>
+              <w:t>Sistema</w:t>
+            </w:r>
+          </w:p>
+        </w:tc>
+        <w:tc>
+          <w:tcPr>
+            <w:tcW w:w="4280" w:type="dxa"/>
+            <w:tcBorders>
+              <w:top w:val="single" w:sz="4" w:space="0" w:color="B7C2D6"/>
+              <w:left w:val="single" w:sz="4" w:space="0" w:color="B7C2D6"/>
+              <w:bottom w:val="single" w:sz="4" w:space="0" w:color="B7C2D6"/>
+              <w:right w:val="single" w:sz="4" w:space="0" w:color="B7C2D6"/>
+            </w:tcBorders>
+            <w:tcMar>
+              <w:top w:w="80" w:type="dxa"/>
+              <w:left w:w="130" w:type="dxa"/>
+              <w:bottom w:w="80" w:type="dxa"/>
+              <w:right w:w="130" w:type="dxa"/>
+            </w:tcMar>
+            <w:vAlign w:val="center"/>
+          </w:tcPr>
+          <w:p>
+            <w:proofErr w:type="spellStart"/>
+            <w:r>
+              <w:t>Muestra</w:t>
+            </w:r>
+            <w:proofErr w:type="spellEnd"/>
+            <w:r>
+              <w:t xml:space="preserve"> una </w:t>
+            </w:r>
+            <w:proofErr w:type="spellStart"/>
+            <w:r>
+              <w:t>pequeña</w:t>
+            </w:r>
+            <w:proofErr w:type="spellEnd"/>
+            <w:r>
+              <w:t xml:space="preserve"> carta </w:t>
+            </w:r>
+            <w:proofErr w:type="spellStart"/>
+            <w:r>
+              <w:t>donde</w:t>
+            </w:r>
+            <w:proofErr w:type="spellEnd"/>
+            <w:r>
+              <w:t xml:space="preserve"> se de </w:t>
+            </w:r>
+            <w:proofErr w:type="spellStart"/>
+            <w:r>
+              <w:t>toda</w:t>
+            </w:r>
+            <w:proofErr w:type="spellEnd"/>
+            <w:r>
+              <w:t xml:space="preserve"> la </w:t>
+            </w:r>
+            <w:proofErr w:type="spellStart"/>
+            <w:r>
+              <w:t>informacion</w:t>
+            </w:r>
+            <w:proofErr w:type="spellEnd"/>
+            <w:r>
+              <w:t xml:space="preserve"> de la </w:t>
+            </w:r>
+            <w:proofErr w:type="spellStart"/>
+            <w:r>
+              <w:t>nueva</w:t>
+            </w:r>
+            <w:proofErr w:type="spellEnd"/>
+            <w:r>
+              <w:t xml:space="preserve"> </w:t>
+            </w:r>
+            <w:proofErr w:type="spellStart"/>
+            <w:r>
+              <w:t>mascota</w:t>
+            </w:r>
+            <w:proofErr w:type="spellEnd"/>
+            <w:r>
+              <w:t xml:space="preserve"> </w:t>
+            </w:r>
+            <w:proofErr w:type="spellStart"/>
+            <w:r>
+              <w:t>ingresada</w:t>
+            </w:r>
+            <w:proofErr w:type="spellEnd"/>
           </w:p>
         </w:tc>
         <w:tc>
@@ -3875,6 +4242,7 @@
           <w:sz w:val="24"/>
           <w:szCs w:val="24"/>
         </w:rPr>
+        <w:lastRenderedPageBreak/>
         <w:t>FLUJO ALTERNO</w:t>
       </w:r>
     </w:p>
@@ -4045,6 +4413,9 @@
         </w:tc>
       </w:tr>
       <w:tr>
+        <w:trPr>
+          <w:trHeight w:val="720"/>
+        </w:trPr>
         <w:tc>
           <w:tcPr>
             <w:tcW w:w="1200" w:type="dxa"/>
@@ -4062,7 +4433,11 @@
             </w:tcMar>
             <w:vAlign w:val="center"/>
           </w:tcPr>
-          <w:p/>
+          <w:p>
+            <w:r>
+              <w:t>FA1</w:t>
+            </w:r>
+          </w:p>
         </w:tc>
         <w:tc>
           <w:tcPr>
@@ -4081,7 +4456,11 @@
             </w:tcMar>
             <w:vAlign w:val="center"/>
           </w:tcPr>
-          <w:p/>
+          <w:p>
+            <w:r>
+              <w:t>Sistema</w:t>
+            </w:r>
+          </w:p>
         </w:tc>
         <w:tc>
           <w:tcPr>
@@ -4100,7 +4479,302 @@
             </w:tcMar>
             <w:vAlign w:val="center"/>
           </w:tcPr>
-          <w:p/>
+          <w:p>
+            <w:proofErr w:type="spellStart"/>
+            <w:r>
+              <w:t>Muestra</w:t>
+            </w:r>
+            <w:proofErr w:type="spellEnd"/>
+            <w:r>
+              <w:t xml:space="preserve"> un </w:t>
+            </w:r>
+            <w:proofErr w:type="spellStart"/>
+            <w:r>
+              <w:t>pequeño</w:t>
+            </w:r>
+            <w:proofErr w:type="spellEnd"/>
+            <w:r>
+              <w:t xml:space="preserve"> </w:t>
+            </w:r>
+            <w:proofErr w:type="spellStart"/>
+            <w:r>
+              <w:t>texto</w:t>
+            </w:r>
+            <w:proofErr w:type="spellEnd"/>
+            <w:r>
+              <w:t xml:space="preserve"> </w:t>
+            </w:r>
+            <w:proofErr w:type="spellStart"/>
+            <w:r>
+              <w:t>en</w:t>
+            </w:r>
+            <w:proofErr w:type="spellEnd"/>
+            <w:r>
+              <w:t xml:space="preserve"> el </w:t>
+            </w:r>
+            <w:proofErr w:type="spellStart"/>
+            <w:r>
+              <w:t>cual</w:t>
+            </w:r>
+            <w:proofErr w:type="spellEnd"/>
+            <w:r>
+              <w:t xml:space="preserve"> da a </w:t>
+            </w:r>
+            <w:proofErr w:type="spellStart"/>
+            <w:r>
+              <w:t>conocer</w:t>
+            </w:r>
+            <w:proofErr w:type="spellEnd"/>
+            <w:r>
+              <w:t xml:space="preserve"> que no se </w:t>
+            </w:r>
+            <w:proofErr w:type="spellStart"/>
+            <w:r>
+              <w:t>permite</w:t>
+            </w:r>
+            <w:proofErr w:type="spellEnd"/>
+            <w:r>
+              <w:t xml:space="preserve"> el </w:t>
+            </w:r>
+            <w:proofErr w:type="spellStart"/>
+            <w:r>
+              <w:t>acceso</w:t>
+            </w:r>
+            <w:proofErr w:type="spellEnd"/>
+            <w:r>
+              <w:t xml:space="preserve"> al portal de </w:t>
+            </w:r>
+            <w:proofErr w:type="spellStart"/>
+            <w:r>
+              <w:t>empleados</w:t>
+            </w:r>
+            <w:proofErr w:type="spellEnd"/>
+          </w:p>
+        </w:tc>
+        <w:tc>
+          <w:tcPr>
+            <w:tcW w:w="2400" w:type="dxa"/>
+            <w:tcBorders>
+              <w:top w:val="single" w:sz="4" w:space="0" w:color="B7C2D6"/>
+              <w:left w:val="single" w:sz="4" w:space="0" w:color="B7C2D6"/>
+              <w:bottom w:val="single" w:sz="4" w:space="0" w:color="B7C2D6"/>
+              <w:right w:val="single" w:sz="4" w:space="0" w:color="B7C2D6"/>
+            </w:tcBorders>
+            <w:tcMar>
+              <w:top w:w="80" w:type="dxa"/>
+              <w:left w:w="130" w:type="dxa"/>
+              <w:bottom w:w="80" w:type="dxa"/>
+              <w:right w:w="130" w:type="dxa"/>
+            </w:tcMar>
+            <w:vAlign w:val="center"/>
+          </w:tcPr>
+          <w:p>
+            <w:proofErr w:type="spellStart"/>
+            <w:r>
+              <w:t>U</w:t>
+            </w:r>
+            <w:r>
+              <w:t>suario</w:t>
+            </w:r>
+            <w:proofErr w:type="spellEnd"/>
+            <w:r>
+              <w:t xml:space="preserve"> o </w:t>
+            </w:r>
+            <w:proofErr w:type="spellStart"/>
+            <w:r>
+              <w:t>contraseña</w:t>
+            </w:r>
+            <w:proofErr w:type="spellEnd"/>
+            <w:r>
+              <w:t xml:space="preserve"> son </w:t>
+            </w:r>
+            <w:proofErr w:type="spellStart"/>
+            <w:r>
+              <w:t>incorre</w:t>
+            </w:r>
+            <w:r>
+              <w:t>c</w:t>
+            </w:r>
+            <w:r>
+              <w:t>tas</w:t>
+            </w:r>
+            <w:proofErr w:type="spellEnd"/>
+            <w:r>
+              <w:t xml:space="preserve">, </w:t>
+            </w:r>
+            <w:proofErr w:type="spellStart"/>
+            <w:r>
+              <w:t>Verifica</w:t>
+            </w:r>
+            <w:proofErr w:type="spellEnd"/>
+            <w:r>
+              <w:t xml:space="preserve"> sus </w:t>
+            </w:r>
+            <w:proofErr w:type="spellStart"/>
+            <w:r>
+              <w:t>credenciales</w:t>
+            </w:r>
+            <w:proofErr w:type="spellEnd"/>
+          </w:p>
+        </w:tc>
+      </w:tr>
+      <w:tr>
+        <w:trPr>
+          <w:trHeight w:val="720"/>
+        </w:trPr>
+        <w:tc>
+          <w:tcPr>
+            <w:tcW w:w="1200" w:type="dxa"/>
+            <w:tcBorders>
+              <w:top w:val="single" w:sz="4" w:space="0" w:color="B7C2D6"/>
+              <w:left w:val="single" w:sz="4" w:space="0" w:color="B7C2D6"/>
+              <w:bottom w:val="single" w:sz="4" w:space="0" w:color="B7C2D6"/>
+              <w:right w:val="single" w:sz="4" w:space="0" w:color="B7C2D6"/>
+            </w:tcBorders>
+            <w:tcMar>
+              <w:top w:w="80" w:type="dxa"/>
+              <w:left w:w="130" w:type="dxa"/>
+              <w:bottom w:w="80" w:type="dxa"/>
+              <w:right w:w="130" w:type="dxa"/>
+            </w:tcMar>
+            <w:vAlign w:val="center"/>
+          </w:tcPr>
+          <w:p>
+            <w:r>
+              <w:t>FA2</w:t>
+            </w:r>
+          </w:p>
+        </w:tc>
+        <w:tc>
+          <w:tcPr>
+            <w:tcW w:w="2200" w:type="dxa"/>
+            <w:tcBorders>
+              <w:top w:val="single" w:sz="4" w:space="0" w:color="B7C2D6"/>
+              <w:left w:val="single" w:sz="4" w:space="0" w:color="B7C2D6"/>
+              <w:bottom w:val="single" w:sz="4" w:space="0" w:color="B7C2D6"/>
+              <w:right w:val="single" w:sz="4" w:space="0" w:color="B7C2D6"/>
+            </w:tcBorders>
+            <w:tcMar>
+              <w:top w:w="80" w:type="dxa"/>
+              <w:left w:w="130" w:type="dxa"/>
+              <w:bottom w:w="80" w:type="dxa"/>
+              <w:right w:w="130" w:type="dxa"/>
+            </w:tcMar>
+            <w:vAlign w:val="center"/>
+          </w:tcPr>
+          <w:p>
+            <w:r>
+              <w:t>Sistema</w:t>
+            </w:r>
+          </w:p>
+        </w:tc>
+        <w:tc>
+          <w:tcPr>
+            <w:tcW w:w="4280" w:type="dxa"/>
+            <w:tcBorders>
+              <w:top w:val="single" w:sz="4" w:space="0" w:color="B7C2D6"/>
+              <w:left w:val="single" w:sz="4" w:space="0" w:color="B7C2D6"/>
+              <w:bottom w:val="single" w:sz="4" w:space="0" w:color="B7C2D6"/>
+              <w:right w:val="single" w:sz="4" w:space="0" w:color="B7C2D6"/>
+            </w:tcBorders>
+            <w:tcMar>
+              <w:top w:w="80" w:type="dxa"/>
+              <w:left w:w="130" w:type="dxa"/>
+              <w:bottom w:w="80" w:type="dxa"/>
+              <w:right w:w="130" w:type="dxa"/>
+            </w:tcMar>
+            <w:vAlign w:val="center"/>
+          </w:tcPr>
+          <w:p>
+            <w:proofErr w:type="spellStart"/>
+            <w:r>
+              <w:t>Muestra</w:t>
+            </w:r>
+            <w:proofErr w:type="spellEnd"/>
+            <w:r>
+              <w:t xml:space="preserve"> un </w:t>
+            </w:r>
+            <w:proofErr w:type="spellStart"/>
+            <w:r>
+              <w:t>pequeño</w:t>
+            </w:r>
+            <w:proofErr w:type="spellEnd"/>
+            <w:r>
+              <w:t xml:space="preserve"> </w:t>
+            </w:r>
+            <w:proofErr w:type="spellStart"/>
+            <w:r>
+              <w:t>texto</w:t>
+            </w:r>
+            <w:proofErr w:type="spellEnd"/>
+            <w:r>
+              <w:t xml:space="preserve"> </w:t>
+            </w:r>
+            <w:proofErr w:type="spellStart"/>
+            <w:r>
+              <w:t>en</w:t>
+            </w:r>
+            <w:proofErr w:type="spellEnd"/>
+            <w:r>
+              <w:t xml:space="preserve"> el </w:t>
+            </w:r>
+            <w:proofErr w:type="spellStart"/>
+            <w:r>
+              <w:t>cual</w:t>
+            </w:r>
+            <w:proofErr w:type="spellEnd"/>
+            <w:r>
+              <w:t xml:space="preserve"> da a </w:t>
+            </w:r>
+            <w:proofErr w:type="spellStart"/>
+            <w:r>
+              <w:t>conocer</w:t>
+            </w:r>
+            <w:proofErr w:type="spellEnd"/>
+            <w:r>
+              <w:t xml:space="preserve"> que </w:t>
+            </w:r>
+            <w:r>
+              <w:t xml:space="preserve">se </w:t>
+            </w:r>
+            <w:proofErr w:type="spellStart"/>
+            <w:r>
+              <w:t>necesita</w:t>
+            </w:r>
+            <w:proofErr w:type="spellEnd"/>
+            <w:r>
+              <w:t xml:space="preserve"> </w:t>
+            </w:r>
+            <w:proofErr w:type="spellStart"/>
+            <w:r>
+              <w:t>ingresar</w:t>
+            </w:r>
+            <w:proofErr w:type="spellEnd"/>
+            <w:r>
+              <w:t xml:space="preserve"> los </w:t>
+            </w:r>
+            <w:proofErr w:type="spellStart"/>
+            <w:r>
+              <w:t>datos</w:t>
+            </w:r>
+            <w:proofErr w:type="spellEnd"/>
+            <w:r>
+              <w:t xml:space="preserve"> con el </w:t>
+            </w:r>
+            <w:proofErr w:type="spellStart"/>
+            <w:r>
+              <w:t>tipo</w:t>
+            </w:r>
+            <w:proofErr w:type="spellEnd"/>
+            <w:r>
+              <w:t xml:space="preserve"> </w:t>
+            </w:r>
+            <w:proofErr w:type="spellStart"/>
+            <w:r>
+              <w:t>adecuado</w:t>
+            </w:r>
+            <w:proofErr w:type="spellEnd"/>
+          </w:p>
         </w:tc>
         <w:tc>
           <w:tcPr>
@@ -4176,7 +4850,6 @@
                 <w:sz w:val="20"/>
                 <w:szCs w:val="20"/>
               </w:rPr>
-              <w:lastRenderedPageBreak/>
               <w:t>Notas</w:t>
             </w:r>
             <w:proofErr w:type="spellEnd"/>
@@ -4411,7 +5084,11 @@
             </w:tcMar>
             <w:vAlign w:val="center"/>
           </w:tcPr>
-          <w:p/>
+          <w:p>
+            <w:r>
+              <w:t>RN-01</w:t>
+            </w:r>
+          </w:p>
         </w:tc>
         <w:tc>
           <w:tcPr>
@@ -4430,7 +5107,424 @@
             </w:tcMar>
             <w:vAlign w:val="center"/>
           </w:tcPr>
-          <w:p/>
+          <w:p>
+            <w:r>
+              <w:rPr>
+                <w:rStyle w:val="normaltextrun"/>
+                <w:color w:val="1A1A1A"/>
+                <w:bdr w:val="none" w:sz="0" w:space="0" w:color="auto" w:frame="1"/>
+              </w:rPr>
+              <w:t xml:space="preserve">El </w:t>
+            </w:r>
+            <w:proofErr w:type="spellStart"/>
+            <w:r>
+              <w:rPr>
+                <w:rStyle w:val="normaltextrun"/>
+                <w:color w:val="1A1A1A"/>
+                <w:bdr w:val="none" w:sz="0" w:space="0" w:color="auto" w:frame="1"/>
+              </w:rPr>
+              <w:t>nombre</w:t>
+            </w:r>
+            <w:proofErr w:type="spellEnd"/>
+            <w:r>
+              <w:rPr>
+                <w:rStyle w:val="normaltextrun"/>
+                <w:color w:val="1A1A1A"/>
+                <w:bdr w:val="none" w:sz="0" w:space="0" w:color="auto" w:frame="1"/>
+              </w:rPr>
+              <w:t xml:space="preserve"> de la </w:t>
+            </w:r>
+            <w:proofErr w:type="spellStart"/>
+            <w:r>
+              <w:rPr>
+                <w:rStyle w:val="normaltextrun"/>
+                <w:color w:val="1A1A1A"/>
+                <w:bdr w:val="none" w:sz="0" w:space="0" w:color="auto" w:frame="1"/>
+              </w:rPr>
+              <w:t>mascota</w:t>
+            </w:r>
+            <w:proofErr w:type="spellEnd"/>
+            <w:r>
+              <w:rPr>
+                <w:rStyle w:val="normaltextrun"/>
+                <w:color w:val="1A1A1A"/>
+                <w:bdr w:val="none" w:sz="0" w:space="0" w:color="auto" w:frame="1"/>
+              </w:rPr>
+              <w:t xml:space="preserve"> </w:t>
+            </w:r>
+            <w:proofErr w:type="spellStart"/>
+            <w:r>
+              <w:rPr>
+                <w:rStyle w:val="normaltextrun"/>
+                <w:color w:val="1A1A1A"/>
+                <w:bdr w:val="none" w:sz="0" w:space="0" w:color="auto" w:frame="1"/>
+              </w:rPr>
+              <w:t>tiene</w:t>
+            </w:r>
+            <w:proofErr w:type="spellEnd"/>
+            <w:r>
+              <w:rPr>
+                <w:rStyle w:val="normaltextrun"/>
+                <w:color w:val="1A1A1A"/>
+                <w:bdr w:val="none" w:sz="0" w:space="0" w:color="auto" w:frame="1"/>
+              </w:rPr>
+              <w:t xml:space="preserve"> que </w:t>
+            </w:r>
+            <w:proofErr w:type="spellStart"/>
+            <w:r>
+              <w:rPr>
+                <w:rStyle w:val="normaltextrun"/>
+                <w:color w:val="1A1A1A"/>
+                <w:bdr w:val="none" w:sz="0" w:space="0" w:color="auto" w:frame="1"/>
+              </w:rPr>
+              <w:t>tener</w:t>
+            </w:r>
+            <w:proofErr w:type="spellEnd"/>
+            <w:r>
+              <w:rPr>
+                <w:rStyle w:val="normaltextrun"/>
+                <w:color w:val="1A1A1A"/>
+                <w:bdr w:val="none" w:sz="0" w:space="0" w:color="auto" w:frame="1"/>
+              </w:rPr>
+              <w:t xml:space="preserve"> </w:t>
+            </w:r>
+            <w:proofErr w:type="spellStart"/>
+            <w:r>
+              <w:rPr>
+                <w:rStyle w:val="normaltextrun"/>
+                <w:color w:val="1A1A1A"/>
+                <w:bdr w:val="none" w:sz="0" w:space="0" w:color="auto" w:frame="1"/>
+              </w:rPr>
+              <w:t>minimo</w:t>
+            </w:r>
+            <w:proofErr w:type="spellEnd"/>
+            <w:r>
+              <w:rPr>
+                <w:rStyle w:val="normaltextrun"/>
+                <w:color w:val="1A1A1A"/>
+                <w:bdr w:val="none" w:sz="0" w:space="0" w:color="auto" w:frame="1"/>
+              </w:rPr>
+              <w:t xml:space="preserve"> 3 </w:t>
+            </w:r>
+            <w:proofErr w:type="spellStart"/>
+            <w:r>
+              <w:rPr>
+                <w:rStyle w:val="normaltextrun"/>
+                <w:color w:val="1A1A1A"/>
+                <w:bdr w:val="none" w:sz="0" w:space="0" w:color="auto" w:frame="1"/>
+              </w:rPr>
+              <w:t>caracteres</w:t>
+            </w:r>
+            <w:proofErr w:type="spellEnd"/>
+          </w:p>
+        </w:tc>
+      </w:tr>
+      <w:tr>
+        <w:tc>
+          <w:tcPr>
+            <w:tcW w:w="1400" w:type="dxa"/>
+            <w:tcBorders>
+              <w:top w:val="single" w:sz="4" w:space="0" w:color="B7C2D6"/>
+              <w:left w:val="single" w:sz="4" w:space="0" w:color="B7C2D6"/>
+              <w:bottom w:val="single" w:sz="4" w:space="0" w:color="B7C2D6"/>
+              <w:right w:val="single" w:sz="4" w:space="0" w:color="B7C2D6"/>
+            </w:tcBorders>
+            <w:tcMar>
+              <w:top w:w="80" w:type="dxa"/>
+              <w:left w:w="130" w:type="dxa"/>
+              <w:bottom w:w="80" w:type="dxa"/>
+              <w:right w:w="130" w:type="dxa"/>
+            </w:tcMar>
+            <w:vAlign w:val="center"/>
+          </w:tcPr>
+          <w:p>
+            <w:r>
+              <w:t>RN-02</w:t>
+            </w:r>
+          </w:p>
+        </w:tc>
+        <w:tc>
+          <w:tcPr>
+            <w:tcW w:w="8680" w:type="dxa"/>
+            <w:tcBorders>
+              <w:top w:val="single" w:sz="4" w:space="0" w:color="B7C2D6"/>
+              <w:left w:val="single" w:sz="4" w:space="0" w:color="B7C2D6"/>
+              <w:bottom w:val="single" w:sz="4" w:space="0" w:color="B7C2D6"/>
+              <w:right w:val="single" w:sz="4" w:space="0" w:color="B7C2D6"/>
+            </w:tcBorders>
+            <w:tcMar>
+              <w:top w:w="80" w:type="dxa"/>
+              <w:left w:w="130" w:type="dxa"/>
+              <w:bottom w:w="80" w:type="dxa"/>
+              <w:right w:w="130" w:type="dxa"/>
+            </w:tcMar>
+            <w:vAlign w:val="center"/>
+          </w:tcPr>
+          <w:p>
+            <w:pPr>
+              <w:rPr>
+                <w:rStyle w:val="normaltextrun"/>
+                <w:color w:val="1A1A1A"/>
+                <w:bdr w:val="none" w:sz="0" w:space="0" w:color="auto" w:frame="1"/>
+              </w:rPr>
+            </w:pPr>
+            <w:r>
+              <w:rPr>
+                <w:rStyle w:val="normaltextrun"/>
+                <w:color w:val="1A1A1A"/>
+                <w:shd w:val="clear" w:color="auto" w:fill="FFFFFF"/>
+              </w:rPr>
+              <w:t xml:space="preserve">La </w:t>
+            </w:r>
+            <w:proofErr w:type="spellStart"/>
+            <w:r>
+              <w:rPr>
+                <w:rStyle w:val="normaltextrun"/>
+                <w:color w:val="1A1A1A"/>
+                <w:shd w:val="clear" w:color="auto" w:fill="FFFFFF"/>
+              </w:rPr>
+              <w:t>edad</w:t>
+            </w:r>
+            <w:proofErr w:type="spellEnd"/>
+            <w:r>
+              <w:rPr>
+                <w:rStyle w:val="normaltextrun"/>
+                <w:color w:val="1A1A1A"/>
+                <w:shd w:val="clear" w:color="auto" w:fill="FFFFFF"/>
+              </w:rPr>
+              <w:t xml:space="preserve"> de la </w:t>
+            </w:r>
+            <w:proofErr w:type="spellStart"/>
+            <w:r>
+              <w:rPr>
+                <w:rStyle w:val="normaltextrun"/>
+                <w:color w:val="1A1A1A"/>
+                <w:shd w:val="clear" w:color="auto" w:fill="FFFFFF"/>
+              </w:rPr>
+              <w:t>mascota</w:t>
+            </w:r>
+            <w:proofErr w:type="spellEnd"/>
+            <w:r>
+              <w:rPr>
+                <w:rStyle w:val="normaltextrun"/>
+                <w:color w:val="1A1A1A"/>
+                <w:shd w:val="clear" w:color="auto" w:fill="FFFFFF"/>
+              </w:rPr>
+              <w:t xml:space="preserve"> no </w:t>
+            </w:r>
+            <w:proofErr w:type="spellStart"/>
+            <w:r>
+              <w:rPr>
+                <w:rStyle w:val="normaltextrun"/>
+                <w:color w:val="1A1A1A"/>
+                <w:shd w:val="clear" w:color="auto" w:fill="FFFFFF"/>
+              </w:rPr>
+              <w:t>puede</w:t>
+            </w:r>
+            <w:proofErr w:type="spellEnd"/>
+            <w:r>
+              <w:rPr>
+                <w:rStyle w:val="normaltextrun"/>
+                <w:color w:val="1A1A1A"/>
+                <w:shd w:val="clear" w:color="auto" w:fill="FFFFFF"/>
+              </w:rPr>
+              <w:t xml:space="preserve"> ser 0</w:t>
+            </w:r>
+          </w:p>
+        </w:tc>
+      </w:tr>
+      <w:tr>
+        <w:tc>
+          <w:tcPr>
+            <w:tcW w:w="1400" w:type="dxa"/>
+            <w:tcBorders>
+              <w:top w:val="single" w:sz="4" w:space="0" w:color="B7C2D6"/>
+              <w:left w:val="single" w:sz="4" w:space="0" w:color="B7C2D6"/>
+              <w:bottom w:val="single" w:sz="4" w:space="0" w:color="B7C2D6"/>
+              <w:right w:val="single" w:sz="4" w:space="0" w:color="B7C2D6"/>
+            </w:tcBorders>
+            <w:tcMar>
+              <w:top w:w="80" w:type="dxa"/>
+              <w:left w:w="130" w:type="dxa"/>
+              <w:bottom w:w="80" w:type="dxa"/>
+              <w:right w:w="130" w:type="dxa"/>
+            </w:tcMar>
+            <w:vAlign w:val="center"/>
+          </w:tcPr>
+          <w:p>
+            <w:r>
+              <w:t>RN-03</w:t>
+            </w:r>
+          </w:p>
+        </w:tc>
+        <w:tc>
+          <w:tcPr>
+            <w:tcW w:w="8680" w:type="dxa"/>
+            <w:tcBorders>
+              <w:top w:val="single" w:sz="4" w:space="0" w:color="B7C2D6"/>
+              <w:left w:val="single" w:sz="4" w:space="0" w:color="B7C2D6"/>
+              <w:bottom w:val="single" w:sz="4" w:space="0" w:color="B7C2D6"/>
+              <w:right w:val="single" w:sz="4" w:space="0" w:color="B7C2D6"/>
+            </w:tcBorders>
+            <w:tcMar>
+              <w:top w:w="80" w:type="dxa"/>
+              <w:left w:w="130" w:type="dxa"/>
+              <w:bottom w:w="80" w:type="dxa"/>
+              <w:right w:w="130" w:type="dxa"/>
+            </w:tcMar>
+            <w:vAlign w:val="center"/>
+          </w:tcPr>
+          <w:p>
+            <w:pPr>
+              <w:rPr>
+                <w:rStyle w:val="normaltextrun"/>
+                <w:color w:val="1A1A1A"/>
+                <w:shd w:val="clear" w:color="auto" w:fill="FFFFFF"/>
+              </w:rPr>
+            </w:pPr>
+            <w:r>
+              <w:rPr>
+                <w:rStyle w:val="normaltextrun"/>
+                <w:color w:val="1A1A1A"/>
+                <w:shd w:val="clear" w:color="auto" w:fill="FFFFFF"/>
+              </w:rPr>
+              <w:t xml:space="preserve">La </w:t>
+            </w:r>
+            <w:proofErr w:type="spellStart"/>
+            <w:r>
+              <w:rPr>
+                <w:rStyle w:val="normaltextrun"/>
+                <w:color w:val="1A1A1A"/>
+                <w:shd w:val="clear" w:color="auto" w:fill="FFFFFF"/>
+              </w:rPr>
+              <w:t>mascota</w:t>
+            </w:r>
+            <w:proofErr w:type="spellEnd"/>
+            <w:r>
+              <w:rPr>
+                <w:rStyle w:val="normaltextrun"/>
+                <w:color w:val="1A1A1A"/>
+                <w:shd w:val="clear" w:color="auto" w:fill="FFFFFF"/>
+              </w:rPr>
+              <w:t xml:space="preserve"> </w:t>
+            </w:r>
+            <w:proofErr w:type="spellStart"/>
+            <w:r>
+              <w:rPr>
+                <w:rStyle w:val="normaltextrun"/>
+                <w:color w:val="1A1A1A"/>
+                <w:shd w:val="clear" w:color="auto" w:fill="FFFFFF"/>
+              </w:rPr>
+              <w:t>tiene</w:t>
+            </w:r>
+            <w:proofErr w:type="spellEnd"/>
+            <w:r>
+              <w:rPr>
+                <w:rStyle w:val="normaltextrun"/>
+                <w:color w:val="1A1A1A"/>
+                <w:shd w:val="clear" w:color="auto" w:fill="FFFFFF"/>
+              </w:rPr>
+              <w:t xml:space="preserve"> que </w:t>
+            </w:r>
+            <w:proofErr w:type="spellStart"/>
+            <w:r>
+              <w:rPr>
+                <w:rStyle w:val="normaltextrun"/>
+                <w:color w:val="1A1A1A"/>
+                <w:shd w:val="clear" w:color="auto" w:fill="FFFFFF"/>
+              </w:rPr>
+              <w:t>pertenecer</w:t>
+            </w:r>
+            <w:proofErr w:type="spellEnd"/>
+            <w:r>
+              <w:rPr>
+                <w:rStyle w:val="normaltextrun"/>
+                <w:color w:val="1A1A1A"/>
+                <w:shd w:val="clear" w:color="auto" w:fill="FFFFFF"/>
+              </w:rPr>
+              <w:t xml:space="preserve"> a un </w:t>
+            </w:r>
+            <w:proofErr w:type="spellStart"/>
+            <w:r>
+              <w:rPr>
+                <w:rStyle w:val="normaltextrun"/>
+                <w:color w:val="1A1A1A"/>
+                <w:shd w:val="clear" w:color="auto" w:fill="FFFFFF"/>
+              </w:rPr>
+              <w:t>refugio</w:t>
+            </w:r>
+            <w:proofErr w:type="spellEnd"/>
+          </w:p>
+        </w:tc>
+      </w:tr>
+      <w:tr>
+        <w:tc>
+          <w:tcPr>
+            <w:tcW w:w="1400" w:type="dxa"/>
+            <w:tcBorders>
+              <w:top w:val="single" w:sz="4" w:space="0" w:color="B7C2D6"/>
+              <w:left w:val="single" w:sz="4" w:space="0" w:color="B7C2D6"/>
+              <w:bottom w:val="single" w:sz="4" w:space="0" w:color="B7C2D6"/>
+              <w:right w:val="single" w:sz="4" w:space="0" w:color="B7C2D6"/>
+            </w:tcBorders>
+            <w:tcMar>
+              <w:top w:w="80" w:type="dxa"/>
+              <w:left w:w="130" w:type="dxa"/>
+              <w:bottom w:w="80" w:type="dxa"/>
+              <w:right w:w="130" w:type="dxa"/>
+            </w:tcMar>
+            <w:vAlign w:val="center"/>
+          </w:tcPr>
+          <w:p>
+            <w:r>
+              <w:t>RN-04</w:t>
+            </w:r>
+          </w:p>
+        </w:tc>
+        <w:tc>
+          <w:tcPr>
+            <w:tcW w:w="8680" w:type="dxa"/>
+            <w:tcBorders>
+              <w:top w:val="single" w:sz="4" w:space="0" w:color="B7C2D6"/>
+              <w:left w:val="single" w:sz="4" w:space="0" w:color="B7C2D6"/>
+              <w:bottom w:val="single" w:sz="4" w:space="0" w:color="B7C2D6"/>
+              <w:right w:val="single" w:sz="4" w:space="0" w:color="B7C2D6"/>
+            </w:tcBorders>
+            <w:tcMar>
+              <w:top w:w="80" w:type="dxa"/>
+              <w:left w:w="130" w:type="dxa"/>
+              <w:bottom w:w="80" w:type="dxa"/>
+              <w:right w:w="130" w:type="dxa"/>
+            </w:tcMar>
+            <w:vAlign w:val="center"/>
+          </w:tcPr>
+          <w:p>
+            <w:pPr>
+              <w:rPr>
+                <w:rStyle w:val="normaltextrun"/>
+                <w:color w:val="1A1A1A"/>
+                <w:shd w:val="clear" w:color="auto" w:fill="FFFFFF"/>
+              </w:rPr>
+            </w:pPr>
+            <w:r>
+              <w:rPr>
+                <w:rStyle w:val="normaltextrun"/>
+                <w:color w:val="1A1A1A"/>
+                <w:shd w:val="clear" w:color="auto" w:fill="FFFFFF"/>
+              </w:rPr>
+              <w:t xml:space="preserve">El ID es </w:t>
+            </w:r>
+            <w:proofErr w:type="spellStart"/>
+            <w:r>
+              <w:rPr>
+                <w:rStyle w:val="normaltextrun"/>
+                <w:color w:val="1A1A1A"/>
+                <w:shd w:val="clear" w:color="auto" w:fill="FFFFFF"/>
+              </w:rPr>
+              <w:t>autogenerado</w:t>
+            </w:r>
+            <w:proofErr w:type="spellEnd"/>
+          </w:p>
         </w:tc>
       </w:tr>
     </w:tbl>
@@ -4870,148 +5964,110 @@
             <w:vAlign w:val="center"/>
           </w:tcPr>
           <w:p>
-            <w:proofErr w:type="spellStart"/>
             <w:r>
               <w:rPr>
                 <w:color w:val="1A1A1A"/>
                 <w:sz w:val="20"/>
                 <w:szCs w:val="20"/>
               </w:rPr>
-              <w:t>Equipo</w:t>
-            </w:r>
-            <w:proofErr w:type="spellEnd"/>
+              <w:t>PAW CONNECT</w:t>
+            </w:r>
+          </w:p>
+        </w:tc>
+        <w:tc>
+          <w:tcPr>
+            <w:tcW w:w="2400" w:type="dxa"/>
+            <w:tcBorders>
+              <w:top w:val="single" w:sz="4" w:space="0" w:color="B7C2D6"/>
+              <w:left w:val="single" w:sz="4" w:space="0" w:color="B7C2D6"/>
+              <w:bottom w:val="single" w:sz="4" w:space="0" w:color="B7C2D6"/>
+              <w:right w:val="single" w:sz="4" w:space="0" w:color="B7C2D6"/>
+            </w:tcBorders>
+            <w:tcMar>
+              <w:top w:w="80" w:type="dxa"/>
+              <w:left w:w="130" w:type="dxa"/>
+              <w:bottom w:w="80" w:type="dxa"/>
+              <w:right w:w="130" w:type="dxa"/>
+            </w:tcMar>
+            <w:vAlign w:val="center"/>
+          </w:tcPr>
+          <w:p>
+            <w:proofErr w:type="spellStart"/>
+            <w:r>
+              <w:t>Administrador</w:t>
+            </w:r>
+            <w:proofErr w:type="spellEnd"/>
+          </w:p>
+        </w:tc>
+        <w:tc>
+          <w:tcPr>
+            <w:tcW w:w="1800" w:type="dxa"/>
+            <w:tcBorders>
+              <w:top w:val="single" w:sz="4" w:space="0" w:color="B7C2D6"/>
+              <w:left w:val="single" w:sz="4" w:space="0" w:color="B7C2D6"/>
+              <w:bottom w:val="single" w:sz="4" w:space="0" w:color="B7C2D6"/>
+              <w:right w:val="single" w:sz="4" w:space="0" w:color="B7C2D6"/>
+            </w:tcBorders>
+            <w:tcMar>
+              <w:top w:w="80" w:type="dxa"/>
+              <w:left w:w="130" w:type="dxa"/>
+              <w:bottom w:w="80" w:type="dxa"/>
+              <w:right w:w="130" w:type="dxa"/>
+            </w:tcMar>
+            <w:vAlign w:val="center"/>
+          </w:tcPr>
+          <w:p>
+            <w:pPr>
+              <w:jc w:val="center"/>
+            </w:pPr>
             <w:r>
               <w:rPr>
                 <w:color w:val="1A1A1A"/>
                 <w:sz w:val="20"/>
                 <w:szCs w:val="20"/>
               </w:rPr>
-              <w:t xml:space="preserve"> DOSW</w:t>
-            </w:r>
-          </w:p>
-        </w:tc>
-        <w:tc>
-          <w:tcPr>
-            <w:tcW w:w="2400" w:type="dxa"/>
-            <w:tcBorders>
-              <w:top w:val="single" w:sz="4" w:space="0" w:color="B7C2D6"/>
-              <w:left w:val="single" w:sz="4" w:space="0" w:color="B7C2D6"/>
-              <w:bottom w:val="single" w:sz="4" w:space="0" w:color="B7C2D6"/>
-              <w:right w:val="single" w:sz="4" w:space="0" w:color="B7C2D6"/>
-            </w:tcBorders>
-            <w:tcMar>
-              <w:top w:w="80" w:type="dxa"/>
-              <w:left w:w="130" w:type="dxa"/>
-              <w:bottom w:w="80" w:type="dxa"/>
-              <w:right w:w="130" w:type="dxa"/>
-            </w:tcMar>
-            <w:vAlign w:val="center"/>
-          </w:tcPr>
-          <w:p/>
-        </w:tc>
-        <w:tc>
-          <w:tcPr>
-            <w:tcW w:w="1800" w:type="dxa"/>
-            <w:tcBorders>
-              <w:top w:val="single" w:sz="4" w:space="0" w:color="B7C2D6"/>
-              <w:left w:val="single" w:sz="4" w:space="0" w:color="B7C2D6"/>
-              <w:bottom w:val="single" w:sz="4" w:space="0" w:color="B7C2D6"/>
-              <w:right w:val="single" w:sz="4" w:space="0" w:color="B7C2D6"/>
-            </w:tcBorders>
-            <w:tcMar>
-              <w:top w:w="80" w:type="dxa"/>
-              <w:left w:w="130" w:type="dxa"/>
-              <w:bottom w:w="80" w:type="dxa"/>
-              <w:right w:w="130" w:type="dxa"/>
-            </w:tcMar>
-            <w:vAlign w:val="center"/>
-          </w:tcPr>
-          <w:p>
-            <w:pPr>
-              <w:jc w:val="center"/>
-            </w:pPr>
+              <w:t>01/09/2026</w:t>
+            </w:r>
+          </w:p>
+        </w:tc>
+        <w:tc>
+          <w:tcPr>
+            <w:tcW w:w="3480" w:type="dxa"/>
+            <w:tcBorders>
+              <w:top w:val="single" w:sz="4" w:space="0" w:color="B7C2D6"/>
+              <w:left w:val="single" w:sz="4" w:space="0" w:color="B7C2D6"/>
+              <w:bottom w:val="single" w:sz="4" w:space="0" w:color="B7C2D6"/>
+              <w:right w:val="single" w:sz="4" w:space="0" w:color="B7C2D6"/>
+            </w:tcBorders>
+            <w:tcMar>
+              <w:top w:w="80" w:type="dxa"/>
+              <w:left w:w="130" w:type="dxa"/>
+              <w:bottom w:w="80" w:type="dxa"/>
+              <w:right w:w="130" w:type="dxa"/>
+            </w:tcMar>
+            <w:vAlign w:val="center"/>
+          </w:tcPr>
+          <w:p>
+            <w:proofErr w:type="spellStart"/>
             <w:r>
               <w:rPr>
                 <w:color w:val="1A1A1A"/>
                 <w:sz w:val="20"/>
                 <w:szCs w:val="20"/>
               </w:rPr>
-              <w:t>DD/MM/AAAA</w:t>
-            </w:r>
-          </w:p>
-        </w:tc>
-        <w:tc>
-          <w:tcPr>
-            <w:tcW w:w="3480" w:type="dxa"/>
-            <w:tcBorders>
-              <w:top w:val="single" w:sz="4" w:space="0" w:color="B7C2D6"/>
-              <w:left w:val="single" w:sz="4" w:space="0" w:color="B7C2D6"/>
-              <w:bottom w:val="single" w:sz="4" w:space="0" w:color="B7C2D6"/>
-              <w:right w:val="single" w:sz="4" w:space="0" w:color="B7C2D6"/>
-            </w:tcBorders>
-            <w:tcMar>
-              <w:top w:w="80" w:type="dxa"/>
-              <w:left w:w="130" w:type="dxa"/>
-              <w:bottom w:w="80" w:type="dxa"/>
-              <w:right w:w="130" w:type="dxa"/>
-            </w:tcMar>
-            <w:vAlign w:val="center"/>
-          </w:tcPr>
-          <w:p>
-            <w:proofErr w:type="spellStart"/>
+              <w:t>Agregacion</w:t>
+            </w:r>
+            <w:proofErr w:type="spellEnd"/>
             <w:r>
               <w:rPr>
                 <w:color w:val="1A1A1A"/>
                 <w:sz w:val="20"/>
                 <w:szCs w:val="20"/>
               </w:rPr>
-              <w:t>Versión</w:t>
-            </w:r>
-            <w:proofErr w:type="spellEnd"/>
-            <w:r>
-              <w:rPr>
-                <w:color w:val="1A1A1A"/>
-                <w:sz w:val="20"/>
-                <w:szCs w:val="20"/>
-              </w:rPr>
-              <w:t xml:space="preserve"> </w:t>
-            </w:r>
-            <w:proofErr w:type="spellStart"/>
-            <w:r>
-              <w:rPr>
-                <w:color w:val="1A1A1A"/>
-                <w:sz w:val="20"/>
-                <w:szCs w:val="20"/>
-              </w:rPr>
-              <w:t>inicial</w:t>
-            </w:r>
-            <w:proofErr w:type="spellEnd"/>
-            <w:r>
-              <w:rPr>
-                <w:color w:val="1A1A1A"/>
-                <w:sz w:val="20"/>
-                <w:szCs w:val="20"/>
-              </w:rPr>
-              <w:t xml:space="preserve"> del </w:t>
-            </w:r>
-            <w:proofErr w:type="spellStart"/>
-            <w:r>
-              <w:rPr>
-                <w:color w:val="1A1A1A"/>
-                <w:sz w:val="20"/>
-                <w:szCs w:val="20"/>
-              </w:rPr>
-              <w:t>documento</w:t>
-            </w:r>
-            <w:proofErr w:type="spellEnd"/>
-            <w:r>
-              <w:rPr>
-                <w:color w:val="1A1A1A"/>
-                <w:sz w:val="20"/>
-                <w:szCs w:val="20"/>
-              </w:rPr>
-              <w:t>.</w:t>
-            </w:r>
+              <w:t xml:space="preserve"> de Funcionalidad</w:t>
+            </w:r>
+            <w:bookmarkStart w:id="0" w:name="_GoBack"/>
+            <w:bookmarkEnd w:id="0"/>
           </w:p>
         </w:tc>
       </w:tr>
@@ -6002,6 +7058,11 @@
       </w:tblCellMar>
     </w:tblPr>
   </w:style>
+  <w:style w:type="character" w:customStyle="1" w:styleId="normaltextrun">
+    <w:name w:val="normaltextrun"/>
+    <w:basedOn w:val="DefaultParagraphFont"/>
+    <w:rsid w:val="00694C1C"/>
+  </w:style>
 </w:styles>
 </file>
 
@@ -6326,21 +7387,12 @@
 </file>
 
 <file path=customXml/item1.xml><?xml version="1.0" encoding="utf-8"?>
-<p:properties xmlns:p="http://schemas.microsoft.com/office/2006/metadata/properties" xmlns:xsi="http://www.w3.org/2001/XMLSchema-instance" xmlns:pc="http://schemas.microsoft.com/office/infopath/2007/PartnerControls">
-  <documentManagement/>
-</p:properties>
+<go:gDocsCustomXmlDataStorage xmlns:go="http://customooxmlschemas.google.com/" xmlns:r="http://schemas.openxmlformats.org/officeDocument/2006/relationships" uri="GoogleDocsCustomDataVersion2">
+  <go:docsCustomData xmlns:go="http://customooxmlschemas.google.com/" roundtripDataSignature="AMtx7mjtEGxBuoPmVpJaMSOuw1TLIxq6mQ==">CgMxLjA4AHIhMUZvRXV1d25Yd002YkVaclVlRHFtdHdrLTEwdFVVMFkw</go:docsCustomData>
+</go:gDocsCustomXmlDataStorage>
 </file>
 
 <file path=customXml/item2.xml><?xml version="1.0" encoding="utf-8"?>
-<?mso-contentType ?>
-<FormTemplates xmlns="http://schemas.microsoft.com/sharepoint/v3/contenttype/forms">
-  <Display>DocumentLibraryForm</Display>
-  <Edit>DocumentLibraryForm</Edit>
-  <New>DocumentLibraryForm</New>
-</FormTemplates>
-</file>
-
-<file path=customXml/item3.xml><?xml version="1.0" encoding="utf-8"?>
 <ct:contentTypeSchema xmlns:ct="http://schemas.microsoft.com/office/2006/metadata/contentType" xmlns:ma="http://schemas.microsoft.com/office/2006/metadata/properties/metaAttributes" ct:_="" ma:_="" ma:contentTypeName="Document" ma:contentTypeID="0x0101002B5BAC97FAEABB4E9C157EE386378C88" ma:contentTypeVersion="3" ma:contentTypeDescription="Create a new document." ma:contentTypeScope="" ma:versionID="85d5ae5d0ece85e3f4382fb4c1c77f0c">
   <xsd:schema xmlns:xsd="http://www.w3.org/2001/XMLSchema" xmlns:xs="http://www.w3.org/2001/XMLSchema" xmlns:p="http://schemas.microsoft.com/office/2006/metadata/properties" xmlns:ns2="a4ca1935-4d02-4ee2-b565-35cc2fa3819b" targetNamespace="http://schemas.microsoft.com/office/2006/metadata/properties" ma:root="true" ma:fieldsID="32962a3a470fc06c75339fbd17211022" ns2:_="">
     <xsd:import namespace="a4ca1935-4d02-4ee2-b565-35cc2fa3819b"/>
@@ -6478,30 +7530,31 @@
 </ct:contentTypeSchema>
 </file>
 
+<file path=customXml/item3.xml><?xml version="1.0" encoding="utf-8"?>
+<?mso-contentType ?>
+<FormTemplates xmlns="http://schemas.microsoft.com/sharepoint/v3/contenttype/forms">
+  <Display>DocumentLibraryForm</Display>
+  <Edit>DocumentLibraryForm</Edit>
+  <New>DocumentLibraryForm</New>
+</FormTemplates>
+</file>
+
 <file path=customXml/item4.xml><?xml version="1.0" encoding="utf-8"?>
-<go:gDocsCustomXmlDataStorage xmlns:go="http://customooxmlschemas.google.com/" xmlns:r="http://schemas.openxmlformats.org/officeDocument/2006/relationships" uri="GoogleDocsCustomDataVersion2">
-  <go:docsCustomData xmlns:go="http://customooxmlschemas.google.com/" roundtripDataSignature="AMtx7mjtEGxBuoPmVpJaMSOuw1TLIxq6mQ==">CgMxLjA4AHIhMUZvRXV1d25Yd002YkVaclVlRHFtdHdrLTEwdFVVMFkw</go:docsCustomData>
-</go:gDocsCustomXmlDataStorage>
+<p:properties xmlns:p="http://schemas.microsoft.com/office/2006/metadata/properties" xmlns:xsi="http://www.w3.org/2001/XMLSchema-instance" xmlns:pc="http://schemas.microsoft.com/office/infopath/2007/PartnerControls">
+  <documentManagement/>
+</p:properties>
 </file>
 
 <file path=customXml/itemProps1.xml><?xml version="1.0" encoding="utf-8"?>
-<ds:datastoreItem xmlns:ds="http://schemas.openxmlformats.org/officeDocument/2006/customXml" ds:itemID="{2C8DB052-A8C5-4A76-8631-0D388F12579B}">
+<ds:datastoreItem xmlns:ds="http://schemas.openxmlformats.org/officeDocument/2006/customXml" ds:itemID="{11111111-1234-1234-1234-123412341234}">
   <ds:schemaRefs>
-    <ds:schemaRef ds:uri="http://schemas.microsoft.com/office/2006/metadata/properties"/>
-    <ds:schemaRef ds:uri="http://schemas.microsoft.com/office/infopath/2007/PartnerControls"/>
+    <ds:schemaRef ds:uri="http://customooxmlschemas.google.com/"/>
+    <ds:schemaRef ds:uri="http://schemas.openxmlformats.org/officeDocument/2006/relationships"/>
   </ds:schemaRefs>
 </ds:datastoreItem>
 </file>
 
 <file path=customXml/itemProps2.xml><?xml version="1.0" encoding="utf-8"?>
-<ds:datastoreItem xmlns:ds="http://schemas.openxmlformats.org/officeDocument/2006/customXml" ds:itemID="{F5FEE064-F001-4A19-93A2-D82A57462B81}">
-  <ds:schemaRefs>
-    <ds:schemaRef ds:uri="http://schemas.microsoft.com/sharepoint/v3/contenttype/forms"/>
-  </ds:schemaRefs>
-</ds:datastoreItem>
-</file>
-
-<file path=customXml/itemProps3.xml><?xml version="1.0" encoding="utf-8"?>
 <ds:datastoreItem xmlns:ds="http://schemas.openxmlformats.org/officeDocument/2006/customXml" ds:itemID="{5CF694BF-BF02-49BD-87C1-9974C33CEA64}">
   <ds:schemaRefs>
     <ds:schemaRef ds:uri="http://schemas.microsoft.com/office/2006/metadata/contentType"/>
@@ -6519,11 +7572,19 @@
 </ds:datastoreItem>
 </file>
 
+<file path=customXml/itemProps3.xml><?xml version="1.0" encoding="utf-8"?>
+<ds:datastoreItem xmlns:ds="http://schemas.openxmlformats.org/officeDocument/2006/customXml" ds:itemID="{F5FEE064-F001-4A19-93A2-D82A57462B81}">
+  <ds:schemaRefs>
+    <ds:schemaRef ds:uri="http://schemas.microsoft.com/sharepoint/v3/contenttype/forms"/>
+  </ds:schemaRefs>
+</ds:datastoreItem>
+</file>
+
 <file path=customXml/itemProps4.xml><?xml version="1.0" encoding="utf-8"?>
-<ds:datastoreItem xmlns:ds="http://schemas.openxmlformats.org/officeDocument/2006/customXml" ds:itemID="{11111111-1234-1234-1234-123412341234}">
+<ds:datastoreItem xmlns:ds="http://schemas.openxmlformats.org/officeDocument/2006/customXml" ds:itemID="{2C8DB052-A8C5-4A76-8631-0D388F12579B}">
   <ds:schemaRefs>
-    <ds:schemaRef ds:uri="http://customooxmlschemas.google.com/"/>
-    <ds:schemaRef ds:uri="http://schemas.openxmlformats.org/officeDocument/2006/relationships"/>
+    <ds:schemaRef ds:uri="http://schemas.microsoft.com/office/2006/metadata/properties"/>
+    <ds:schemaRef ds:uri="http://schemas.microsoft.com/office/infopath/2007/PartnerControls"/>
   </ds:schemaRefs>
 </ds:datastoreItem>
 </file>
</xml_diff>